<commit_message>
Décima Terceira Versão - Parte 3
</commit_message>
<xml_diff>
--- a/docs/Projeto do sistema de medição de grandezas físicas.docx
+++ b/docs/Projeto do sistema de medição de grandezas físicas.docx
@@ -1,6 +1,6 @@
 
 <file path=word/document.xml><?xml version="1.0" encoding="utf-8"?>
-<w:document xmlns:wpc="http://schemas.microsoft.com/office/word/2010/wordprocessingCanvas" xmlns:cx="http://schemas.microsoft.com/office/drawing/2014/chartex" xmlns:cx1="http://schemas.microsoft.com/office/drawing/2015/9/8/chartex" xmlns:cx2="http://schemas.microsoft.com/office/drawing/2015/10/21/chartex" xmlns:cx3="http://schemas.microsoft.com/office/drawing/2016/5/9/chartex" xmlns:cx4="http://schemas.microsoft.com/office/drawing/2016/5/10/chartex" xmlns:cx5="http://schemas.microsoft.com/office/drawing/2016/5/11/chartex" xmlns:cx6="http://schemas.microsoft.com/office/drawing/2016/5/12/chartex" xmlns:cx7="http://schemas.microsoft.com/office/drawing/2016/5/13/chartex" xmlns:cx8="http://schemas.microsoft.com/office/drawing/2016/5/14/chartex" xmlns:mc="http://schemas.openxmlformats.org/markup-compatibility/2006" xmlns:aink="http://schemas.microsoft.com/office/drawing/2016/ink" xmlns:am3d="http://schemas.microsoft.com/office/drawing/2017/model3d" xmlns:o="urn:schemas-microsoft-com:office:office" xmlns:oel="http://schemas.microsoft.com/office/2019/extlst" xmlns:r="http://schemas.openxmlformats.org/officeDocument/2006/relationships" xmlns:m="http://schemas.openxmlformats.org/officeDocument/2006/math" xmlns:v="urn:schemas-microsoft-com:vml" xmlns:wp14="http://schemas.microsoft.com/office/word/2010/wordprocessingDrawing" xmlns:wp="http://schemas.openxmlformats.org/drawingml/2006/wordprocessingDrawing" xmlns:w10="urn:schemas-microsoft-com:office:word" xmlns:w="http://schemas.openxmlformats.org/wordprocessingml/2006/main" xmlns:w14="http://schemas.microsoft.com/office/word/2010/wordml" xmlns:w15="http://schemas.microsoft.com/office/word/2012/wordml" xmlns:w16cex="http://schemas.microsoft.com/office/word/2018/wordml/cex" xmlns:w16cid="http://schemas.microsoft.com/office/word/2016/wordml/cid" xmlns:w16="http://schemas.microsoft.com/office/word/2018/wordml" xmlns:w16sdtdh="http://schemas.microsoft.com/office/word/2020/wordml/sdtdatahash" xmlns:w16se="http://schemas.microsoft.com/office/word/2015/wordml/symex" xmlns:wpg="http://schemas.microsoft.com/office/word/2010/wordprocessingGroup" xmlns:wpi="http://schemas.microsoft.com/office/word/2010/wordprocessingInk" xmlns:wne="http://schemas.microsoft.com/office/word/2006/wordml" xmlns:wps="http://schemas.microsoft.com/office/word/2010/wordprocessingShape" mc:Ignorable="w14 w15 w16se w16cid w16 w16cex w16sdtdh wp14">
+<w:document xmlns:wpc="http://schemas.microsoft.com/office/word/2010/wordprocessingCanvas" xmlns:cx="http://schemas.microsoft.com/office/drawing/2014/chartex" xmlns:cx1="http://schemas.microsoft.com/office/drawing/2015/9/8/chartex" xmlns:cx2="http://schemas.microsoft.com/office/drawing/2015/10/21/chartex" xmlns:cx3="http://schemas.microsoft.com/office/drawing/2016/5/9/chartex" xmlns:cx4="http://schemas.microsoft.com/office/drawing/2016/5/10/chartex" xmlns:cx5="http://schemas.microsoft.com/office/drawing/2016/5/11/chartex" xmlns:cx6="http://schemas.microsoft.com/office/drawing/2016/5/12/chartex" xmlns:cx7="http://schemas.microsoft.com/office/drawing/2016/5/13/chartex" xmlns:cx8="http://schemas.microsoft.com/office/drawing/2016/5/14/chartex" xmlns:mc="http://schemas.openxmlformats.org/markup-compatibility/2006" xmlns:aink="http://schemas.microsoft.com/office/drawing/2016/ink" xmlns:am3d="http://schemas.microsoft.com/office/drawing/2017/model3d" xmlns:o="urn:schemas-microsoft-com:office:office" xmlns:oel="http://schemas.microsoft.com/office/2019/extlst" xmlns:r="http://schemas.openxmlformats.org/officeDocument/2006/relationships" xmlns:m="http://schemas.openxmlformats.org/officeDocument/2006/math" xmlns:v="urn:schemas-microsoft-com:vml" xmlns:wp14="http://schemas.microsoft.com/office/word/2010/wordprocessingDrawing" xmlns:wp="http://schemas.openxmlformats.org/drawingml/2006/wordprocessingDrawing" xmlns:w10="urn:schemas-microsoft-com:office:word" xmlns:w="http://schemas.openxmlformats.org/wordprocessingml/2006/main" xmlns:w14="http://schemas.microsoft.com/office/word/2010/wordml" xmlns:w15="http://schemas.microsoft.com/office/word/2012/wordml" xmlns:w16cex="http://schemas.microsoft.com/office/word/2018/wordml/cex" xmlns:w16cid="http://schemas.microsoft.com/office/word/2016/wordml/cid" xmlns:w16="http://schemas.microsoft.com/office/word/2018/wordml" xmlns:w16du="http://schemas.microsoft.com/office/word/2023/wordml/word16du" xmlns:w16sdtdh="http://schemas.microsoft.com/office/word/2020/wordml/sdtdatahash" xmlns:w16sdtfl="http://schemas.microsoft.com/office/word/2024/wordml/sdtformatlock" xmlns:w16se="http://schemas.microsoft.com/office/word/2015/wordml/symex" xmlns:wpg="http://schemas.microsoft.com/office/word/2010/wordprocessingGroup" xmlns:wpi="http://schemas.microsoft.com/office/word/2010/wordprocessingInk" xmlns:wne="http://schemas.microsoft.com/office/word/2006/wordml" xmlns:wps="http://schemas.microsoft.com/office/word/2010/wordprocessingShape" mc:Ignorable="w14 w15 w16se w16cid w16 w16cex w16sdtdh w16sdtfl w16du wp14">
   <w:body>
     <w:p>
       <w:pPr>
@@ -90,6 +90,17 @@
     </w:p>
     <w:p>
       <w:pPr>
+        <w:pBdr>
+          <w:bottom w:val="single" w:sz="6" w:space="1" w:color="auto"/>
+        </w:pBdr>
+        <w:jc w:val="both"/>
+        <w:rPr>
+          <w:rFonts w:ascii="Arial" w:hAnsi="Arial" w:cs="Arial"/>
+        </w:rPr>
+      </w:pPr>
+    </w:p>
+    <w:p>
+      <w:pPr>
         <w:jc w:val="both"/>
         <w:rPr>
           <w:rFonts w:ascii="Arial" w:hAnsi="Arial" w:cs="Arial"/>
@@ -276,16 +287,6 @@
         </w:rPr>
         <w:t>A medição de temperatura é realizada utilizando sensores térmicos, como termistores (NTC/PTC), termopares ou sensores digitais, que variam suas propriedades elétricas conforme a temperatura. Esses sensores convertem a variação térmica em sinais elétricos que podem ser lidos e interpretados por circuitos ou sistemas, como o Arduino.</w:t>
       </w:r>
-    </w:p>
-    <w:p>
-      <w:pPr>
-        <w:jc w:val="both"/>
-        <w:rPr>
-          <w:rFonts w:ascii="Arial" w:hAnsi="Arial" w:cs="Arial"/>
-          <w:b/>
-          <w:bCs/>
-        </w:rPr>
-      </w:pPr>
     </w:p>
     <w:p>
       <w:pPr>
@@ -1478,16 +1479,6 @@
           <w:bCs/>
         </w:rPr>
       </w:pPr>
-    </w:p>
-    <w:p>
-      <w:pPr>
-        <w:jc w:val="both"/>
-        <w:rPr>
-          <w:rFonts w:ascii="Arial" w:hAnsi="Arial" w:cs="Arial"/>
-          <w:b/>
-          <w:bCs/>
-        </w:rPr>
-      </w:pPr>
       <w:r>
         <w:rPr>
           <w:rFonts w:ascii="Arial" w:hAnsi="Arial" w:cs="Arial"/>
@@ -2002,6 +1993,7 @@
           <w:bCs/>
           <w:u w:val="single"/>
         </w:rPr>
+        <w:lastRenderedPageBreak/>
         <w:t>Precis</w:t>
       </w:r>
       <w:r>
@@ -2709,42 +2701,895 @@
           <w:b/>
           <w:bCs/>
         </w:rPr>
+        <w:t>Conex</w:t>
+      </w:r>
+      <w:r>
+        <w:rPr>
+          <w:rFonts w:ascii="Arial" w:hAnsi="Arial" w:cs="Arial" w:hint="cs"/>
+          <w:b/>
+          <w:bCs/>
+        </w:rPr>
+        <w:t>ã</w:t>
+      </w:r>
+      <w:r>
+        <w:rPr>
+          <w:rFonts w:ascii="Arial" w:hAnsi="Arial" w:cs="Arial"/>
+          <w:b/>
+          <w:bCs/>
+        </w:rPr>
+        <w:t xml:space="preserve">o: </w:t>
+      </w:r>
+      <w:r>
+        <w:rPr>
+          <w:rFonts w:ascii="Arial" w:hAnsi="Arial" w:cs="Arial"/>
+        </w:rPr>
+        <w:t>RTDs podem exigir 3 ou 4 fios para compensar a resist</w:t>
+      </w:r>
+      <w:r>
+        <w:rPr>
+          <w:rFonts w:ascii="Arial" w:hAnsi="Arial" w:cs="Arial" w:hint="cs"/>
+        </w:rPr>
+        <w:t>ê</w:t>
+      </w:r>
+      <w:r>
+        <w:rPr>
+          <w:rFonts w:ascii="Arial" w:hAnsi="Arial" w:cs="Arial"/>
+        </w:rPr>
+        <w:t>ncia do cabo, enquanto termopares exigem fios de extens</w:t>
+      </w:r>
+      <w:r>
+        <w:rPr>
+          <w:rFonts w:ascii="Arial" w:hAnsi="Arial" w:cs="Arial" w:hint="cs"/>
+        </w:rPr>
+        <w:t>ã</w:t>
+      </w:r>
+      <w:r>
+        <w:rPr>
+          <w:rFonts w:ascii="Arial" w:hAnsi="Arial" w:cs="Arial"/>
+        </w:rPr>
+        <w:t>o espec</w:t>
+      </w:r>
+      <w:r>
+        <w:rPr>
+          <w:rFonts w:ascii="Arial" w:hAnsi="Arial" w:cs="Arial" w:hint="cs"/>
+        </w:rPr>
+        <w:t>í</w:t>
+      </w:r>
+      <w:r>
+        <w:rPr>
+          <w:rFonts w:ascii="Arial" w:hAnsi="Arial" w:cs="Arial"/>
+        </w:rPr>
+        <w:t>ficos.</w:t>
+      </w:r>
+      <w:r>
+        <w:rPr>
+          <w:rFonts w:ascii="Arial" w:hAnsi="Arial" w:cs="Arial" w:hint="cs"/>
+          <w:b/>
+          <w:bCs/>
+        </w:rPr>
+        <w:t> </w:t>
+      </w:r>
+    </w:p>
+    <w:p>
+      <w:pPr>
+        <w:jc w:val="both"/>
+        <w:rPr>
+          <w:rFonts w:ascii="Arial" w:hAnsi="Arial" w:cs="Arial"/>
+          <w:b/>
+          <w:bCs/>
+        </w:rPr>
+      </w:pPr>
+      <w:r>
+        <w:rPr>
+          <w:rFonts w:ascii="Arial" w:hAnsi="Arial" w:cs="Arial"/>
+          <w:b/>
+          <w:bCs/>
+        </w:rPr>
         <w:lastRenderedPageBreak/>
-        <w:t>Conex</w:t>
-      </w:r>
-      <w:r>
-        <w:rPr>
-          <w:rFonts w:ascii="Arial" w:hAnsi="Arial" w:cs="Arial" w:hint="cs"/>
-          <w:b/>
-          <w:bCs/>
+        <w:t xml:space="preserve">10) </w:t>
+      </w:r>
+      <w:r>
+        <w:rPr>
+          <w:rFonts w:ascii="Arial" w:hAnsi="Arial" w:cs="Arial"/>
+          <w:b/>
+          <w:bCs/>
+        </w:rPr>
+        <w:t>O que é o ardu</w:t>
+      </w:r>
+      <w:r>
+        <w:rPr>
+          <w:rFonts w:ascii="Arial" w:hAnsi="Arial" w:cs="Arial"/>
+          <w:b/>
+          <w:bCs/>
+        </w:rPr>
+        <w:t>i</w:t>
+      </w:r>
+      <w:r>
+        <w:rPr>
+          <w:rFonts w:ascii="Arial" w:hAnsi="Arial" w:cs="Arial"/>
+          <w:b/>
+          <w:bCs/>
+        </w:rPr>
+        <w:t>no?</w:t>
+      </w:r>
+    </w:p>
+    <w:p>
+      <w:pPr>
+        <w:jc w:val="both"/>
+        <w:rPr>
+          <w:rFonts w:ascii="Arial" w:hAnsi="Arial" w:cs="Arial"/>
+          <w:b/>
+          <w:bCs/>
+        </w:rPr>
+      </w:pPr>
+      <w:r>
+        <w:rPr>
+          <w:rFonts w:ascii="Arial" w:hAnsi="Arial" w:cs="Arial"/>
+          <w:b/>
+          <w:bCs/>
+        </w:rPr>
+        <w:t xml:space="preserve">10) R: </w:t>
+      </w:r>
+      <w:r>
+        <w:rPr>
+          <w:rFonts w:ascii="Arial" w:hAnsi="Arial" w:cs="Arial" w:hint="cs"/>
+        </w:rPr>
+        <w:t>É</w:t>
+      </w:r>
+      <w:r>
+        <w:rPr>
+          <w:rFonts w:ascii="Arial" w:hAnsi="Arial" w:cs="Arial"/>
+        </w:rPr>
+        <w:t xml:space="preserve"> uma plataforma de prototipagem eletr</w:t>
+      </w:r>
+      <w:r>
+        <w:rPr>
+          <w:rFonts w:ascii="Arial" w:hAnsi="Arial" w:cs="Arial" w:hint="cs"/>
+        </w:rPr>
+        <w:t>ô</w:t>
+      </w:r>
+      <w:r>
+        <w:rPr>
+          <w:rFonts w:ascii="Arial" w:hAnsi="Arial" w:cs="Arial"/>
+        </w:rPr>
+        <w:t>nica de c</w:t>
+      </w:r>
+      <w:r>
+        <w:rPr>
+          <w:rFonts w:ascii="Arial" w:hAnsi="Arial" w:cs="Arial" w:hint="cs"/>
+        </w:rPr>
+        <w:t>ó</w:t>
+      </w:r>
+      <w:r>
+        <w:rPr>
+          <w:rFonts w:ascii="Arial" w:hAnsi="Arial" w:cs="Arial"/>
+        </w:rPr>
+        <w:t>digo aberto que combina hardware (uma placa com um microcontrolador) e software (uma ferramenta de desenvolvimento) para criar projetos interativos de forma acess</w:t>
+      </w:r>
+      <w:r>
+        <w:rPr>
+          <w:rFonts w:ascii="Arial" w:hAnsi="Arial" w:cs="Arial" w:hint="cs"/>
+        </w:rPr>
+        <w:t>í</w:t>
+      </w:r>
+      <w:r>
+        <w:rPr>
+          <w:rFonts w:ascii="Arial" w:hAnsi="Arial" w:cs="Arial"/>
+        </w:rPr>
+        <w:t>vel e simples.</w:t>
+      </w:r>
+    </w:p>
+    <w:p>
+      <w:pPr>
+        <w:jc w:val="both"/>
+        <w:rPr>
+          <w:rFonts w:ascii="Arial" w:hAnsi="Arial" w:cs="Arial"/>
+          <w:b/>
+          <w:bCs/>
+        </w:rPr>
+      </w:pPr>
+    </w:p>
+    <w:p>
+      <w:pPr>
+        <w:jc w:val="both"/>
+        <w:rPr>
+          <w:rFonts w:ascii="Arial" w:hAnsi="Arial" w:cs="Arial"/>
+          <w:b/>
+          <w:bCs/>
+        </w:rPr>
+      </w:pPr>
+      <w:r>
+        <w:rPr>
+          <w:rFonts w:ascii="Arial" w:hAnsi="Arial" w:cs="Arial"/>
+          <w:b/>
+          <w:bCs/>
+        </w:rPr>
+        <w:t xml:space="preserve">11) </w:t>
+      </w:r>
+      <w:r>
+        <w:rPr>
+          <w:rFonts w:ascii="Arial" w:hAnsi="Arial" w:cs="Arial"/>
+          <w:b/>
+          <w:bCs/>
+        </w:rPr>
+        <w:t>Qual é a escala analógica do arduino</w:t>
+      </w:r>
+      <w:r>
+        <w:rPr>
+          <w:rFonts w:ascii="Arial" w:hAnsi="Arial" w:cs="Arial"/>
+          <w:b/>
+          <w:bCs/>
+        </w:rPr>
+        <w:t>?</w:t>
+      </w:r>
+    </w:p>
+    <w:p>
+      <w:pPr>
+        <w:jc w:val="both"/>
+        <w:rPr>
+          <w:rFonts w:ascii="Arial" w:hAnsi="Arial" w:cs="Arial"/>
+        </w:rPr>
+      </w:pPr>
+      <w:r>
+        <w:rPr>
+          <w:rFonts w:ascii="Arial" w:hAnsi="Arial" w:cs="Arial"/>
+          <w:b/>
+          <w:bCs/>
+        </w:rPr>
+        <w:t xml:space="preserve">11) R: </w:t>
+      </w:r>
+      <w:r>
+        <w:rPr>
+          <w:rFonts w:ascii="Arial" w:hAnsi="Arial" w:cs="Arial"/>
+        </w:rPr>
+        <w:t>A escala analógica do Arduino, nas placas mais comuns como Uno, Nano e Mega, possui resolução de 10 bits na entrada, variando de 0 a 1023, representando tensões geralmente entre 0 e 5 volts. Já na saída, os valores variam de 0 a 255, pois é utilizada a técnica de PWM, com resolução de 8 bits.</w:t>
+      </w:r>
+    </w:p>
+    <w:p>
+      <w:pPr>
+        <w:jc w:val="both"/>
+        <w:rPr>
+          <w:rFonts w:ascii="Arial" w:hAnsi="Arial" w:cs="Arial"/>
+          <w:b/>
+          <w:bCs/>
+        </w:rPr>
+      </w:pPr>
+    </w:p>
+    <w:p>
+      <w:pPr>
+        <w:jc w:val="both"/>
+        <w:rPr>
+          <w:rFonts w:ascii="Arial" w:hAnsi="Arial" w:cs="Arial"/>
+          <w:b/>
+          <w:bCs/>
+        </w:rPr>
+      </w:pPr>
+      <w:r>
+        <w:rPr>
+          <w:rFonts w:ascii="Arial" w:hAnsi="Arial" w:cs="Arial"/>
+          <w:b/>
+          <w:bCs/>
+        </w:rPr>
+        <w:t xml:space="preserve">12) </w:t>
+      </w:r>
+      <w:r>
+        <w:rPr>
+          <w:rFonts w:ascii="Arial" w:hAnsi="Arial" w:cs="Arial"/>
+          <w:b/>
+          <w:bCs/>
+        </w:rPr>
+        <w:t>O que é entrada analógica e o que é entrada digital no ardu</w:t>
+      </w:r>
+      <w:r>
+        <w:rPr>
+          <w:rFonts w:ascii="Arial" w:hAnsi="Arial" w:cs="Arial"/>
+          <w:b/>
+          <w:bCs/>
+        </w:rPr>
+        <w:t>i</w:t>
+      </w:r>
+      <w:r>
+        <w:rPr>
+          <w:rFonts w:ascii="Arial" w:hAnsi="Arial" w:cs="Arial"/>
+          <w:b/>
+          <w:bCs/>
+        </w:rPr>
+        <w:t>no?</w:t>
+      </w:r>
+    </w:p>
+    <w:p>
+      <w:pPr>
+        <w:jc w:val="both"/>
+        <w:rPr>
+          <w:rFonts w:ascii="Arial" w:hAnsi="Arial" w:cs="Arial"/>
+        </w:rPr>
+      </w:pPr>
+      <w:r>
+        <w:rPr>
+          <w:rFonts w:ascii="Arial" w:hAnsi="Arial" w:cs="Arial"/>
+          <w:b/>
+          <w:bCs/>
+        </w:rPr>
+        <w:t xml:space="preserve">12) R: </w:t>
+      </w:r>
+      <w:r>
+        <w:rPr>
+          <w:rFonts w:ascii="Arial" w:hAnsi="Arial" w:cs="Arial"/>
+        </w:rPr>
+        <w:t>No Arduino, entrada analógica é o tipo de entrada responsável por ler sinais elétricos contínuos, que variam em uma escala numérica. No Arduino Uno, essa escala vai de 0 a 1023, representando uma variação de tensão de 0</w:t>
+      </w:r>
+      <w:r>
+        <w:rPr>
+          <w:rFonts w:ascii="Arial" w:hAnsi="Arial" w:cs="Arial"/>
+        </w:rPr>
+        <w:t xml:space="preserve"> V</w:t>
+      </w:r>
+      <w:r>
+        <w:rPr>
+          <w:rFonts w:ascii="Arial" w:hAnsi="Arial" w:cs="Arial"/>
+        </w:rPr>
+        <w:t xml:space="preserve"> a 5</w:t>
+      </w:r>
+      <w:r>
+        <w:rPr>
+          <w:rFonts w:ascii="Arial" w:hAnsi="Arial" w:cs="Arial"/>
+        </w:rPr>
+        <w:t xml:space="preserve"> </w:t>
+      </w:r>
+      <w:r>
+        <w:rPr>
+          <w:rFonts w:ascii="Arial" w:hAnsi="Arial" w:cs="Arial"/>
+        </w:rPr>
+        <w:t>V, permitindo medir mudanças graduais de um fenômeno físico.</w:t>
+      </w:r>
+    </w:p>
+    <w:p>
+      <w:pPr>
+        <w:jc w:val="both"/>
+        <w:rPr>
+          <w:rFonts w:ascii="Arial" w:hAnsi="Arial" w:cs="Arial"/>
+        </w:rPr>
+      </w:pPr>
+    </w:p>
+    <w:p>
+      <w:pPr>
+        <w:jc w:val="both"/>
+        <w:rPr>
+          <w:rFonts w:ascii="Arial" w:hAnsi="Arial" w:cs="Arial"/>
+        </w:rPr>
+      </w:pPr>
+      <w:r>
+        <w:rPr>
+          <w:rFonts w:ascii="Arial" w:hAnsi="Arial" w:cs="Arial"/>
+        </w:rPr>
+        <w:t>Já a entrada digital é a entrada que reconhece apenas dois estados possíveis em sua escala lógica: 0 (LOW</w:t>
+      </w:r>
+      <w:r>
+        <w:rPr>
+          <w:rFonts w:ascii="Arial" w:hAnsi="Arial" w:cs="Arial"/>
+        </w:rPr>
+        <w:t xml:space="preserve"> / 0</w:t>
+      </w:r>
+      <w:r>
+        <w:rPr>
+          <w:rFonts w:ascii="Arial" w:hAnsi="Arial" w:cs="Arial"/>
+        </w:rPr>
+        <w:t xml:space="preserve"> </w:t>
+      </w:r>
+      <w:r>
+        <w:rPr>
+          <w:rFonts w:ascii="Arial" w:hAnsi="Arial" w:cs="Arial"/>
+        </w:rPr>
+        <w:t>V</w:t>
+      </w:r>
+      <w:r>
+        <w:rPr>
+          <w:rFonts w:ascii="Arial" w:hAnsi="Arial" w:cs="Arial"/>
+        </w:rPr>
+        <w:t>) para nível baixo e 1 (HIGH</w:t>
+      </w:r>
+      <w:r>
+        <w:rPr>
+          <w:rFonts w:ascii="Arial" w:hAnsi="Arial" w:cs="Arial"/>
+        </w:rPr>
+        <w:t xml:space="preserve"> / 5 V</w:t>
+      </w:r>
+      <w:r>
+        <w:rPr>
+          <w:rFonts w:ascii="Arial" w:hAnsi="Arial" w:cs="Arial"/>
+        </w:rPr>
+        <w:t>) para nível alto</w:t>
+      </w:r>
+      <w:r>
+        <w:rPr>
+          <w:rFonts w:ascii="Arial" w:hAnsi="Arial" w:cs="Arial"/>
+        </w:rPr>
+        <w:t>.</w:t>
+      </w:r>
+    </w:p>
+    <w:p>
+      <w:pPr>
+        <w:jc w:val="both"/>
+        <w:rPr>
+          <w:rFonts w:ascii="Arial" w:hAnsi="Arial" w:cs="Arial"/>
+        </w:rPr>
+      </w:pPr>
+    </w:p>
+    <w:p>
+      <w:pPr>
+        <w:jc w:val="both"/>
+        <w:rPr>
+          <w:rFonts w:ascii="Arial" w:hAnsi="Arial" w:cs="Arial"/>
+          <w:b/>
+          <w:bCs/>
+        </w:rPr>
+      </w:pPr>
+      <w:r>
+        <w:rPr>
+          <w:rFonts w:ascii="Arial" w:hAnsi="Arial" w:cs="Arial"/>
+          <w:b/>
+          <w:bCs/>
+        </w:rPr>
+        <w:t>12.1) O que é saída analógica (PWM) ardu</w:t>
+      </w:r>
+      <w:r>
+        <w:rPr>
+          <w:rFonts w:ascii="Arial" w:hAnsi="Arial" w:cs="Arial"/>
+          <w:b/>
+          <w:bCs/>
+        </w:rPr>
+        <w:t>i</w:t>
+      </w:r>
+      <w:r>
+        <w:rPr>
+          <w:rFonts w:ascii="Arial" w:hAnsi="Arial" w:cs="Arial"/>
+          <w:b/>
+          <w:bCs/>
+        </w:rPr>
+        <w:t>no?</w:t>
+      </w:r>
+    </w:p>
+    <w:p>
+      <w:pPr>
+        <w:jc w:val="both"/>
+        <w:rPr>
+          <w:rFonts w:ascii="Arial" w:hAnsi="Arial" w:cs="Arial"/>
+        </w:rPr>
+      </w:pPr>
+      <w:r>
+        <w:rPr>
+          <w:rFonts w:ascii="Arial" w:hAnsi="Arial" w:cs="Arial"/>
+          <w:b/>
+          <w:bCs/>
+        </w:rPr>
+        <w:t xml:space="preserve">12.1) R: </w:t>
+      </w:r>
+      <w:r>
+        <w:rPr>
+          <w:rFonts w:ascii="Arial" w:hAnsi="Arial" w:cs="Arial"/>
+        </w:rPr>
+        <w:t>A saída analógica do Arduino refere-se ao PWM (Modulação por Largura de Pulso). Nesse método, o sinal não é contínuo, mas sim digital, alternando rapidamente entre ligado e desligado. A variação do tempo em que o sinal permanece ligado permite simular diferentes níveis de tensão média.</w:t>
+      </w:r>
+    </w:p>
+    <w:p>
+      <w:pPr>
+        <w:jc w:val="both"/>
+        <w:rPr>
+          <w:rFonts w:ascii="Arial" w:hAnsi="Arial" w:cs="Arial"/>
+          <w:b/>
+          <w:bCs/>
+        </w:rPr>
+      </w:pPr>
+      <w:r>
+        <w:rPr>
+          <w:rFonts w:ascii="Arial" w:hAnsi="Arial" w:cs="Arial"/>
+          <w:b/>
+          <w:bCs/>
+        </w:rPr>
+        <w:t xml:space="preserve"> </w:t>
+      </w:r>
+    </w:p>
+    <w:p>
+      <w:pPr>
+        <w:jc w:val="both"/>
+        <w:rPr>
+          <w:rFonts w:ascii="Arial" w:hAnsi="Arial" w:cs="Arial"/>
+          <w:b/>
+          <w:bCs/>
+        </w:rPr>
+      </w:pPr>
+      <w:r>
+        <w:rPr>
+          <w:rFonts w:ascii="Arial" w:hAnsi="Arial" w:cs="Arial"/>
+          <w:b/>
+          <w:bCs/>
+        </w:rPr>
+        <w:t xml:space="preserve">13) </w:t>
+      </w:r>
+      <w:r>
+        <w:rPr>
+          <w:rFonts w:ascii="Arial" w:hAnsi="Arial" w:cs="Arial"/>
+          <w:b/>
+          <w:bCs/>
+        </w:rPr>
+        <w:t>O que é o CLP?</w:t>
+      </w:r>
+      <w:r>
+        <w:rPr>
+          <w:rFonts w:ascii="Arial" w:hAnsi="Arial" w:cs="Arial"/>
+          <w:b/>
+          <w:bCs/>
+        </w:rPr>
+        <w:t xml:space="preserve"> </w:t>
+      </w:r>
+      <w:r>
+        <w:rPr>
+          <w:rFonts w:ascii="Arial" w:hAnsi="Arial" w:cs="Arial"/>
+          <w:b/>
+          <w:bCs/>
+        </w:rPr>
+        <w:t>(Modelo da CPU 1214c do tipo DC/DC/DC)</w:t>
+      </w:r>
+      <w:r>
+        <w:rPr>
+          <w:rFonts w:ascii="Arial" w:hAnsi="Arial" w:cs="Arial"/>
+          <w:b/>
+          <w:bCs/>
+        </w:rPr>
+        <w:t>.</w:t>
+      </w:r>
+    </w:p>
+    <w:p>
+      <w:pPr>
+        <w:jc w:val="both"/>
+        <w:rPr>
+          <w:rFonts w:ascii="Arial" w:hAnsi="Arial" w:cs="Arial"/>
+        </w:rPr>
+      </w:pPr>
+      <w:r>
+        <w:rPr>
+          <w:rFonts w:ascii="Arial" w:hAnsi="Arial" w:cs="Arial"/>
+          <w:b/>
+          <w:bCs/>
+        </w:rPr>
+        <w:t xml:space="preserve">13) R: </w:t>
+      </w:r>
+      <w:r>
+        <w:rPr>
+          <w:rFonts w:ascii="Arial" w:hAnsi="Arial" w:cs="Arial"/>
+        </w:rPr>
+        <w:t>O CLP (Controlador Lógico Programável) é um equipamento eletrônico industrial projetado para automatizar e controlar máquinas e processos. Ele é composto por hardware robusto, capaz de operar em ambientes industriais, e por software de programação, usado para criar lógicas de controle baseadas em entradas e saídas. Seu objetivo principal é executar comandos de forma confiável, contínua e segura, substituindo sistemas antigos baseados em relés e temporizadores eletromecânicos.</w:t>
+      </w:r>
+    </w:p>
+    <w:p>
+      <w:pPr>
+        <w:jc w:val="both"/>
+        <w:rPr>
+          <w:rFonts w:ascii="Arial" w:hAnsi="Arial" w:cs="Arial"/>
+          <w:b/>
+          <w:bCs/>
+        </w:rPr>
+      </w:pPr>
+      <w:r>
+        <w:rPr>
+          <w:rFonts w:ascii="Arial" w:hAnsi="Arial" w:cs="Arial"/>
+          <w:b/>
+          <w:bCs/>
+        </w:rPr>
+        <w:lastRenderedPageBreak/>
+        <w:t xml:space="preserve">13.1) </w:t>
+      </w:r>
+      <w:r>
+        <w:rPr>
+          <w:rFonts w:ascii="Arial" w:hAnsi="Arial" w:cs="Arial"/>
+          <w:b/>
+          <w:bCs/>
+        </w:rPr>
+        <w:t>Qual é a e</w:t>
+      </w:r>
+      <w:r>
+        <w:rPr>
+          <w:rFonts w:ascii="Arial" w:hAnsi="Arial" w:cs="Arial"/>
+          <w:b/>
+          <w:bCs/>
+        </w:rPr>
+        <w:t xml:space="preserve">scala analógica </w:t>
+      </w:r>
+      <w:r>
+        <w:rPr>
+          <w:rFonts w:ascii="Arial" w:hAnsi="Arial" w:cs="Arial"/>
+          <w:b/>
+          <w:bCs/>
+        </w:rPr>
+        <w:t>n</w:t>
+      </w:r>
+      <w:r>
+        <w:rPr>
+          <w:rFonts w:ascii="Arial" w:hAnsi="Arial" w:cs="Arial"/>
+          <w:b/>
+          <w:bCs/>
+        </w:rPr>
+        <w:t>o CLP</w:t>
+      </w:r>
+      <w:r>
+        <w:rPr>
+          <w:rFonts w:ascii="Arial" w:hAnsi="Arial" w:cs="Arial"/>
+          <w:b/>
+          <w:bCs/>
+        </w:rPr>
+        <w:t>?</w:t>
+      </w:r>
+    </w:p>
+    <w:p>
+      <w:pPr>
+        <w:jc w:val="both"/>
+        <w:rPr>
+          <w:rFonts w:ascii="Arial" w:hAnsi="Arial" w:cs="Arial"/>
+          <w:b/>
+          <w:bCs/>
+        </w:rPr>
+      </w:pPr>
+      <w:r>
+        <w:rPr>
+          <w:rFonts w:ascii="Arial" w:hAnsi="Arial" w:cs="Arial"/>
+          <w:b/>
+          <w:bCs/>
+        </w:rPr>
+        <w:t xml:space="preserve">13.1) R: </w:t>
+      </w:r>
+      <w:r>
+        <w:rPr>
+          <w:rFonts w:ascii="Arial" w:hAnsi="Arial" w:cs="Arial"/>
+        </w:rPr>
+        <w:t>A escala analógica em CLPs representa sinais contínuos, como 0 a 10</w:t>
+      </w:r>
+      <w:r>
+        <w:rPr>
+          <w:rFonts w:ascii="Arial" w:hAnsi="Arial" w:cs="Arial"/>
+        </w:rPr>
+        <w:t xml:space="preserve"> </w:t>
+      </w:r>
+      <w:r>
+        <w:rPr>
+          <w:rFonts w:ascii="Arial" w:hAnsi="Arial" w:cs="Arial"/>
+        </w:rPr>
+        <w:t>V ou 4 a 20 mA, convertidos em valores digitais internos. Geralmente, essa conversão ocorre em uma faixa como 0 a 27648 para 0–10</w:t>
+      </w:r>
+      <w:r>
+        <w:rPr>
+          <w:rFonts w:ascii="Arial" w:hAnsi="Arial" w:cs="Arial"/>
+        </w:rPr>
+        <w:t xml:space="preserve"> </w:t>
+      </w:r>
+      <w:r>
+        <w:rPr>
+          <w:rFonts w:ascii="Arial" w:hAnsi="Arial" w:cs="Arial"/>
+        </w:rPr>
+        <w:t>V, ou aproximadamente 5530 a 27648 para 4–20 mA, permitindo que o CLP processe os sinais com precisão.</w:t>
+      </w:r>
+    </w:p>
+    <w:p>
+      <w:pPr>
+        <w:jc w:val="both"/>
+        <w:rPr>
+          <w:rFonts w:ascii="Arial" w:hAnsi="Arial" w:cs="Arial"/>
+          <w:b/>
+          <w:bCs/>
+        </w:rPr>
+      </w:pPr>
+    </w:p>
+    <w:p>
+      <w:pPr>
+        <w:jc w:val="both"/>
+        <w:rPr>
+          <w:rFonts w:ascii="Arial" w:hAnsi="Arial" w:cs="Arial"/>
+          <w:b/>
+          <w:bCs/>
+        </w:rPr>
+      </w:pPr>
+      <w:r>
+        <w:rPr>
+          <w:rFonts w:ascii="Arial" w:hAnsi="Arial" w:cs="Arial"/>
+          <w:b/>
+          <w:bCs/>
+        </w:rPr>
+        <w:t xml:space="preserve">14) </w:t>
+      </w:r>
+      <w:r>
+        <w:rPr>
+          <w:rFonts w:ascii="Arial" w:hAnsi="Arial" w:cs="Arial"/>
+          <w:b/>
+          <w:bCs/>
+        </w:rPr>
+        <w:t>O que é entrada analógica e o que é entrada digital no CLP?</w:t>
+      </w:r>
+    </w:p>
+    <w:p>
+      <w:pPr>
+        <w:jc w:val="both"/>
+        <w:rPr>
+          <w:rFonts w:ascii="Arial" w:hAnsi="Arial" w:cs="Arial"/>
+        </w:rPr>
+      </w:pPr>
+      <w:r>
+        <w:rPr>
+          <w:rFonts w:ascii="Arial" w:hAnsi="Arial" w:cs="Arial"/>
+          <w:b/>
+          <w:bCs/>
+        </w:rPr>
+        <w:t xml:space="preserve">14) R: </w:t>
+      </w:r>
+      <w:r>
+        <w:rPr>
+          <w:rFonts w:ascii="Arial" w:hAnsi="Arial" w:cs="Arial"/>
+        </w:rPr>
+        <w:t>Em um CLP, a entrada anal</w:t>
+      </w:r>
+      <w:r>
+        <w:rPr>
+          <w:rFonts w:ascii="Arial" w:hAnsi="Arial" w:cs="Arial" w:hint="cs"/>
+        </w:rPr>
+        <w:t>ó</w:t>
+      </w:r>
+      <w:r>
+        <w:rPr>
+          <w:rFonts w:ascii="Arial" w:hAnsi="Arial" w:cs="Arial"/>
+        </w:rPr>
+        <w:t xml:space="preserve">gica </w:t>
+      </w:r>
+      <w:r>
+        <w:rPr>
+          <w:rFonts w:ascii="Arial" w:hAnsi="Arial" w:cs="Arial" w:hint="cs"/>
+        </w:rPr>
+        <w:t>é</w:t>
+      </w:r>
+      <w:r>
+        <w:rPr>
+          <w:rFonts w:ascii="Arial" w:hAnsi="Arial" w:cs="Arial"/>
+        </w:rPr>
+        <w:t xml:space="preserve"> utilizada para ler sinais cont</w:t>
+      </w:r>
+      <w:r>
+        <w:rPr>
+          <w:rFonts w:ascii="Arial" w:hAnsi="Arial" w:cs="Arial" w:hint="cs"/>
+        </w:rPr>
+        <w:t>í</w:t>
+      </w:r>
+      <w:r>
+        <w:rPr>
+          <w:rFonts w:ascii="Arial" w:hAnsi="Arial" w:cs="Arial"/>
+        </w:rPr>
+        <w:t xml:space="preserve">nuos provenientes de sensores industriais. Ela trabalha com escalas padronizadas, como 0 a 10 V, </w:t>
+      </w:r>
+      <w:r>
+        <w:rPr>
+          <w:rFonts w:ascii="Arial" w:hAnsi="Arial" w:cs="Arial" w:hint="cs"/>
+        </w:rPr>
+        <w:t>±</w:t>
+      </w:r>
+      <w:r>
+        <w:rPr>
+          <w:rFonts w:ascii="Arial" w:hAnsi="Arial" w:cs="Arial"/>
+        </w:rPr>
+        <w:t>10 V ou 4 a 20 mA, convertendo esses valores el</w:t>
+      </w:r>
+      <w:r>
+        <w:rPr>
+          <w:rFonts w:ascii="Arial" w:hAnsi="Arial" w:cs="Arial" w:hint="cs"/>
+        </w:rPr>
+        <w:t>é</w:t>
+      </w:r>
+      <w:r>
+        <w:rPr>
+          <w:rFonts w:ascii="Arial" w:hAnsi="Arial" w:cs="Arial"/>
+        </w:rPr>
+        <w:t>tricos em n</w:t>
+      </w:r>
+      <w:r>
+        <w:rPr>
+          <w:rFonts w:ascii="Arial" w:hAnsi="Arial" w:cs="Arial" w:hint="cs"/>
+        </w:rPr>
+        <w:t>ú</w:t>
+      </w:r>
+      <w:r>
+        <w:rPr>
+          <w:rFonts w:ascii="Arial" w:hAnsi="Arial" w:cs="Arial"/>
+        </w:rPr>
+        <w:t>meros que representam varia</w:t>
+      </w:r>
+      <w:r>
+        <w:rPr>
+          <w:rFonts w:ascii="Arial" w:hAnsi="Arial" w:cs="Arial" w:hint="cs"/>
+        </w:rPr>
+        <w:t>çõ</w:t>
+      </w:r>
+      <w:r>
+        <w:rPr>
+          <w:rFonts w:ascii="Arial" w:hAnsi="Arial" w:cs="Arial"/>
+        </w:rPr>
+        <w:t>es graduais de grandezas f</w:t>
+      </w:r>
+      <w:r>
+        <w:rPr>
+          <w:rFonts w:ascii="Arial" w:hAnsi="Arial" w:cs="Arial" w:hint="cs"/>
+        </w:rPr>
+        <w:t>í</w:t>
+      </w:r>
+      <w:r>
+        <w:rPr>
+          <w:rFonts w:ascii="Arial" w:hAnsi="Arial" w:cs="Arial"/>
+        </w:rPr>
+        <w:t>sicas, como temperatura, press</w:t>
+      </w:r>
+      <w:r>
+        <w:rPr>
+          <w:rFonts w:ascii="Arial" w:hAnsi="Arial" w:cs="Arial" w:hint="cs"/>
         </w:rPr>
         <w:t>ã</w:t>
       </w:r>
       <w:r>
         <w:rPr>
           <w:rFonts w:ascii="Arial" w:hAnsi="Arial" w:cs="Arial"/>
-          <w:b/>
-          <w:bCs/>
-        </w:rPr>
-        <w:t xml:space="preserve">o: </w:t>
-      </w:r>
-      <w:r>
-        <w:rPr>
-          <w:rFonts w:ascii="Arial" w:hAnsi="Arial" w:cs="Arial"/>
-        </w:rPr>
-        <w:t>RTDs podem exigir 3 ou 4 fios para compensar a resist</w:t>
-      </w:r>
-      <w:r>
-        <w:rPr>
-          <w:rFonts w:ascii="Arial" w:hAnsi="Arial" w:cs="Arial" w:hint="cs"/>
-        </w:rPr>
-        <w:t>ê</w:t>
-      </w:r>
-      <w:r>
-        <w:rPr>
-          <w:rFonts w:ascii="Arial" w:hAnsi="Arial" w:cs="Arial"/>
-        </w:rPr>
-        <w:t>ncia do cabo, enquanto termopares exigem fios de extens</w:t>
+        </w:rPr>
+        <w:t>o ou n</w:t>
+      </w:r>
+      <w:r>
+        <w:rPr>
+          <w:rFonts w:ascii="Arial" w:hAnsi="Arial" w:cs="Arial" w:hint="cs"/>
+        </w:rPr>
+        <w:t>í</w:t>
+      </w:r>
+      <w:r>
+        <w:rPr>
+          <w:rFonts w:ascii="Arial" w:hAnsi="Arial" w:cs="Arial"/>
+        </w:rPr>
+        <w:t>vel.</w:t>
+      </w:r>
+    </w:p>
+    <w:p>
+      <w:pPr>
+        <w:jc w:val="both"/>
+        <w:rPr>
+          <w:rFonts w:ascii="Arial" w:hAnsi="Arial" w:cs="Arial"/>
+        </w:rPr>
+      </w:pPr>
+    </w:p>
+    <w:p>
+      <w:pPr>
+        <w:jc w:val="both"/>
+        <w:rPr>
+          <w:rFonts w:ascii="Arial" w:hAnsi="Arial" w:cs="Arial"/>
+        </w:rPr>
+      </w:pPr>
+      <w:r>
+        <w:rPr>
+          <w:rFonts w:ascii="Arial" w:hAnsi="Arial" w:cs="Arial"/>
+        </w:rPr>
+        <w:t>J</w:t>
+      </w:r>
+      <w:r>
+        <w:rPr>
+          <w:rFonts w:ascii="Arial" w:hAnsi="Arial" w:cs="Arial" w:hint="cs"/>
+        </w:rPr>
+        <w:t>á</w:t>
+      </w:r>
+      <w:r>
+        <w:rPr>
+          <w:rFonts w:ascii="Arial" w:hAnsi="Arial" w:cs="Arial"/>
+        </w:rPr>
+        <w:t xml:space="preserve"> a entrada digital em um CLP reconhece apenas dois estados l</w:t>
+      </w:r>
+      <w:r>
+        <w:rPr>
+          <w:rFonts w:ascii="Arial" w:hAnsi="Arial" w:cs="Arial" w:hint="cs"/>
+        </w:rPr>
+        <w:t>ó</w:t>
+      </w:r>
+      <w:r>
+        <w:rPr>
+          <w:rFonts w:ascii="Arial" w:hAnsi="Arial" w:cs="Arial"/>
+        </w:rPr>
+        <w:t>gicos em sua escala: 0 ou 1, correspondendo a sinais desligado/ligado. Normalmente esses estados s</w:t>
       </w:r>
       <w:r>
         <w:rPr>
@@ -2756,101 +3601,459 @@
         <w:rPr>
           <w:rFonts w:ascii="Arial" w:hAnsi="Arial" w:cs="Arial"/>
         </w:rPr>
-        <w:t>o espec</w:t>
-      </w:r>
-      <w:r>
-        <w:rPr>
-          <w:rFonts w:ascii="Arial" w:hAnsi="Arial" w:cs="Arial" w:hint="cs"/>
-        </w:rPr>
-        <w:t>í</w:t>
-      </w:r>
-      <w:r>
-        <w:rPr>
-          <w:rFonts w:ascii="Arial" w:hAnsi="Arial" w:cs="Arial"/>
-        </w:rPr>
-        <w:t>ficos.</w:t>
-      </w:r>
-      <w:r>
-        <w:rPr>
-          <w:rFonts w:ascii="Arial" w:hAnsi="Arial" w:cs="Arial" w:hint="cs"/>
-          <w:b/>
-          <w:bCs/>
-        </w:rPr>
-        <w:t> </w:t>
-      </w:r>
-    </w:p>
-    <w:p>
-      <w:pPr>
-        <w:jc w:val="both"/>
-        <w:rPr>
-          <w:rFonts w:ascii="Arial" w:hAnsi="Arial" w:cs="Arial"/>
-          <w:b/>
-          <w:bCs/>
-        </w:rPr>
-      </w:pPr>
-    </w:p>
-    <w:p>
-      <w:pPr>
-        <w:jc w:val="both"/>
-        <w:rPr>
-          <w:rFonts w:ascii="Arial" w:hAnsi="Arial" w:cs="Arial"/>
-          <w:b/>
-          <w:bCs/>
-        </w:rPr>
-      </w:pPr>
-      <w:r>
-        <w:rPr>
-          <w:rFonts w:ascii="Arial" w:hAnsi="Arial" w:cs="Arial"/>
-          <w:b/>
-          <w:bCs/>
-        </w:rPr>
-        <w:t xml:space="preserve">10) </w:t>
-      </w:r>
-      <w:r>
-        <w:rPr>
-          <w:rFonts w:ascii="Arial" w:hAnsi="Arial" w:cs="Arial"/>
-          <w:b/>
-          <w:bCs/>
-        </w:rPr>
-        <w:t>O que é o ardu</w:t>
-      </w:r>
-      <w:r>
-        <w:rPr>
-          <w:rFonts w:ascii="Arial" w:hAnsi="Arial" w:cs="Arial"/>
-          <w:b/>
-          <w:bCs/>
-        </w:rPr>
-        <w:t>i</w:t>
-      </w:r>
-      <w:r>
-        <w:rPr>
-          <w:rFonts w:ascii="Arial" w:hAnsi="Arial" w:cs="Arial"/>
-          <w:b/>
-          <w:bCs/>
-        </w:rPr>
-        <w:t>no?</w:t>
-      </w:r>
-    </w:p>
-    <w:p>
-      <w:pPr>
-        <w:jc w:val="both"/>
-        <w:rPr>
-          <w:rFonts w:ascii="Arial" w:hAnsi="Arial" w:cs="Arial"/>
-          <w:b/>
-          <w:bCs/>
-        </w:rPr>
-      </w:pPr>
-      <w:r>
-        <w:rPr>
-          <w:rFonts w:ascii="Arial" w:hAnsi="Arial" w:cs="Arial"/>
-          <w:b/>
-          <w:bCs/>
-        </w:rPr>
-        <w:t xml:space="preserve">10) R: </w:t>
-      </w:r>
-      <w:r>
-        <w:rPr>
-          <w:rFonts w:ascii="Arial" w:hAnsi="Arial" w:cs="Arial" w:hint="cs"/>
+        <w:t>o representados por tens</w:t>
+      </w:r>
+      <w:r>
+        <w:rPr>
+          <w:rFonts w:ascii="Arial" w:hAnsi="Arial" w:cs="Arial" w:hint="cs"/>
+        </w:rPr>
+        <w:t>õ</w:t>
+      </w:r>
+      <w:r>
+        <w:rPr>
+          <w:rFonts w:ascii="Arial" w:hAnsi="Arial" w:cs="Arial"/>
+        </w:rPr>
+        <w:t>es industriais, como 0 V e 24 V, sendo usadas para dispositivos como bot</w:t>
+      </w:r>
+      <w:r>
+        <w:rPr>
+          <w:rFonts w:ascii="Arial" w:hAnsi="Arial" w:cs="Arial" w:hint="cs"/>
+        </w:rPr>
+        <w:t>õ</w:t>
+      </w:r>
+      <w:r>
+        <w:rPr>
+          <w:rFonts w:ascii="Arial" w:hAnsi="Arial" w:cs="Arial"/>
+        </w:rPr>
+        <w:t>es, chaves, sensores de fim de curso e rel</w:t>
+      </w:r>
+      <w:r>
+        <w:rPr>
+          <w:rFonts w:ascii="Arial" w:hAnsi="Arial" w:cs="Arial" w:hint="cs"/>
+        </w:rPr>
+        <w:t>é</w:t>
+      </w:r>
+      <w:r>
+        <w:rPr>
+          <w:rFonts w:ascii="Arial" w:hAnsi="Arial" w:cs="Arial"/>
+        </w:rPr>
+        <w:t>s.</w:t>
+      </w:r>
+    </w:p>
+    <w:p>
+      <w:pPr>
+        <w:jc w:val="both"/>
+        <w:rPr>
+          <w:rFonts w:ascii="Arial" w:hAnsi="Arial" w:cs="Arial"/>
+        </w:rPr>
+      </w:pPr>
+    </w:p>
+    <w:p>
+      <w:pPr>
+        <w:jc w:val="both"/>
+        <w:rPr>
+          <w:rFonts w:ascii="Arial" w:hAnsi="Arial" w:cs="Arial"/>
+          <w:b/>
+          <w:bCs/>
+        </w:rPr>
+      </w:pPr>
+      <w:r>
+        <w:rPr>
+          <w:rFonts w:ascii="Arial" w:hAnsi="Arial" w:cs="Arial"/>
+          <w:b/>
+          <w:bCs/>
+        </w:rPr>
+        <w:t>1</w:t>
+      </w:r>
+      <w:r>
+        <w:rPr>
+          <w:rFonts w:ascii="Arial" w:hAnsi="Arial" w:cs="Arial"/>
+          <w:b/>
+          <w:bCs/>
+        </w:rPr>
+        <w:t>4</w:t>
+      </w:r>
+      <w:r>
+        <w:rPr>
+          <w:rFonts w:ascii="Arial" w:hAnsi="Arial" w:cs="Arial"/>
+          <w:b/>
+          <w:bCs/>
+        </w:rPr>
+        <w:t>.1) O que é saída analógica no CLP?</w:t>
+      </w:r>
+    </w:p>
+    <w:p>
+      <w:pPr>
+        <w:jc w:val="both"/>
+        <w:rPr>
+          <w:rFonts w:ascii="Arial" w:hAnsi="Arial" w:cs="Arial"/>
+          <w:b/>
+          <w:bCs/>
+        </w:rPr>
+      </w:pPr>
+      <w:r>
+        <w:rPr>
+          <w:rFonts w:ascii="Arial" w:hAnsi="Arial" w:cs="Arial"/>
+          <w:b/>
+          <w:bCs/>
+        </w:rPr>
+        <w:t xml:space="preserve">14.1) R: </w:t>
+      </w:r>
+      <w:r>
+        <w:rPr>
+          <w:rFonts w:ascii="Arial" w:hAnsi="Arial" w:cs="Arial"/>
+        </w:rPr>
+        <w:t>A saída analógica no CLP é um sinal contínuo e real, diferente do Arduino. Ela pode fornecer diretamente valores de tensão (0 a 10</w:t>
+      </w:r>
+      <w:r>
+        <w:rPr>
+          <w:rFonts w:ascii="Arial" w:hAnsi="Arial" w:cs="Arial"/>
+        </w:rPr>
+        <w:t xml:space="preserve"> </w:t>
+      </w:r>
+      <w:r>
+        <w:rPr>
+          <w:rFonts w:ascii="Arial" w:hAnsi="Arial" w:cs="Arial"/>
+        </w:rPr>
+        <w:t>V) ou corrente (4 a 20 mA), sendo utilizada no controle de equipamentos industriais, como motores, válvulas e inversores de frequência.</w:t>
+      </w:r>
+    </w:p>
+    <w:p>
+      <w:pPr>
+        <w:jc w:val="both"/>
+        <w:rPr>
+          <w:rFonts w:ascii="Arial" w:hAnsi="Arial" w:cs="Arial"/>
+          <w:b/>
+          <w:bCs/>
+        </w:rPr>
+      </w:pPr>
+    </w:p>
+    <w:p>
+      <w:pPr>
+        <w:jc w:val="both"/>
+        <w:rPr>
+          <w:rFonts w:ascii="Arial" w:hAnsi="Arial" w:cs="Arial"/>
+          <w:b/>
+          <w:bCs/>
+        </w:rPr>
+      </w:pPr>
+      <w:r>
+        <w:rPr>
+          <w:rFonts w:ascii="Arial" w:hAnsi="Arial" w:cs="Arial"/>
+          <w:b/>
+          <w:bCs/>
+        </w:rPr>
+        <w:t xml:space="preserve">15) </w:t>
+      </w:r>
+      <w:r>
+        <w:rPr>
+          <w:rFonts w:ascii="Arial" w:hAnsi="Arial" w:cs="Arial"/>
+          <w:b/>
+          <w:bCs/>
+        </w:rPr>
+        <w:t xml:space="preserve">O que é a Ponte de Wheatstone? </w:t>
+      </w:r>
+    </w:p>
+    <w:p>
+      <w:pPr>
+        <w:jc w:val="both"/>
+        <w:rPr>
+          <w:rFonts w:ascii="Arial" w:hAnsi="Arial" w:cs="Arial"/>
+          <w:b/>
+          <w:bCs/>
+        </w:rPr>
+      </w:pPr>
+      <w:r>
+        <w:rPr>
+          <w:rFonts w:ascii="Arial" w:hAnsi="Arial" w:cs="Arial"/>
+          <w:b/>
+          <w:bCs/>
+        </w:rPr>
+        <w:t xml:space="preserve">15) R: </w:t>
+      </w:r>
+      <w:r>
+        <w:rPr>
+          <w:rFonts w:ascii="Arial" w:hAnsi="Arial" w:cs="Arial"/>
+        </w:rPr>
+        <w:t>A Ponte de Wheatstone é um circuito elétrico usado para medir resistências elétricas desconhecidas com alta precisão, muito aplicad</w:t>
+      </w:r>
+      <w:r>
+        <w:rPr>
+          <w:rFonts w:ascii="Arial" w:hAnsi="Arial" w:cs="Arial"/>
+        </w:rPr>
+        <w:t>a</w:t>
+      </w:r>
+      <w:r>
+        <w:rPr>
+          <w:rFonts w:ascii="Arial" w:hAnsi="Arial" w:cs="Arial"/>
+        </w:rPr>
+        <w:t xml:space="preserve"> em sensores e instrumentação. Foi inventada por Samuel Hunter Christie em 1833 e popularizada por Charles Wheatstone em 1843. O circuito é composto por quatro resistores em formato de losango, uma fonte de tensão e um detector central (galvanômetro), permitindo determinar com exatidão o valor da resistência medida quando a ponte está em equilíbrio.</w:t>
+      </w:r>
+    </w:p>
+    <w:p>
+      <w:pPr>
+        <w:jc w:val="both"/>
+        <w:rPr>
+          <w:rFonts w:ascii="Arial" w:hAnsi="Arial" w:cs="Arial"/>
+          <w:b/>
+          <w:bCs/>
+        </w:rPr>
+      </w:pPr>
+    </w:p>
+    <w:p>
+      <w:pPr>
+        <w:jc w:val="both"/>
+        <w:rPr>
+          <w:rFonts w:ascii="Arial" w:hAnsi="Arial" w:cs="Arial"/>
+          <w:b/>
+          <w:bCs/>
+        </w:rPr>
+      </w:pPr>
+    </w:p>
+    <w:p>
+      <w:pPr>
+        <w:jc w:val="both"/>
+        <w:rPr>
+          <w:rFonts w:ascii="Arial" w:hAnsi="Arial" w:cs="Arial"/>
+          <w:b/>
+          <w:bCs/>
+        </w:rPr>
+      </w:pPr>
+    </w:p>
+    <w:p>
+      <w:pPr>
+        <w:jc w:val="both"/>
+        <w:rPr>
+          <w:rFonts w:ascii="Arial" w:hAnsi="Arial" w:cs="Arial"/>
+          <w:b/>
+          <w:bCs/>
+        </w:rPr>
+      </w:pPr>
+      <w:r>
+        <w:rPr>
+          <w:rFonts w:ascii="Arial" w:hAnsi="Arial" w:cs="Arial"/>
+          <w:b/>
+          <w:bCs/>
+        </w:rPr>
+        <w:lastRenderedPageBreak/>
+        <w:t xml:space="preserve">16) </w:t>
+      </w:r>
+      <w:r>
+        <w:rPr>
+          <w:rFonts w:ascii="Arial" w:hAnsi="Arial" w:cs="Arial"/>
+          <w:b/>
+          <w:bCs/>
+        </w:rPr>
+        <w:t xml:space="preserve">O que é multímetro? </w:t>
+      </w:r>
+    </w:p>
+    <w:p>
+      <w:pPr>
+        <w:jc w:val="both"/>
+        <w:rPr>
+          <w:rFonts w:ascii="Arial" w:hAnsi="Arial" w:cs="Arial"/>
+        </w:rPr>
+      </w:pPr>
+      <w:r>
+        <w:rPr>
+          <w:rFonts w:ascii="Arial" w:hAnsi="Arial" w:cs="Arial"/>
+          <w:b/>
+          <w:bCs/>
+        </w:rPr>
+        <w:t>16) R:</w:t>
+      </w:r>
+      <w:r>
+        <w:rPr>
+          <w:rFonts w:ascii="Arial" w:hAnsi="Arial" w:cs="Arial"/>
+          <w:b/>
+          <w:bCs/>
+        </w:rPr>
+        <w:t xml:space="preserve"> </w:t>
+      </w:r>
+      <w:r>
+        <w:rPr>
+          <w:rFonts w:ascii="Arial" w:hAnsi="Arial" w:cs="Arial"/>
+        </w:rPr>
+        <w:t>É um instrumento de medição portátil usado para medir grandezas elétricas como tensão (voltagem), corrente (amperagem) e resistência (ohms).</w:t>
+      </w:r>
+    </w:p>
+    <w:p>
+      <w:pPr>
+        <w:jc w:val="both"/>
+        <w:rPr>
+          <w:rFonts w:ascii="Arial" w:hAnsi="Arial" w:cs="Arial"/>
+          <w:b/>
+          <w:bCs/>
+        </w:rPr>
+      </w:pPr>
+    </w:p>
+    <w:p>
+      <w:pPr>
+        <w:jc w:val="both"/>
+        <w:rPr>
+          <w:rFonts w:ascii="Arial" w:hAnsi="Arial" w:cs="Arial"/>
+          <w:b/>
+          <w:bCs/>
+        </w:rPr>
+      </w:pPr>
+      <w:r>
+        <w:rPr>
+          <w:rFonts w:ascii="Arial" w:hAnsi="Arial" w:cs="Arial"/>
+          <w:b/>
+          <w:bCs/>
+        </w:rPr>
+        <w:t xml:space="preserve">17) </w:t>
+      </w:r>
+      <w:r>
+        <w:rPr>
+          <w:rFonts w:ascii="Arial" w:hAnsi="Arial" w:cs="Arial"/>
+          <w:b/>
+          <w:bCs/>
+        </w:rPr>
+        <w:t>Exemplo de medição em mili volts do termopar Tipo K</w:t>
+      </w:r>
+    </w:p>
+    <w:p>
+      <w:pPr>
+        <w:jc w:val="both"/>
+        <w:rPr>
+          <w:rFonts w:ascii="Arial" w:hAnsi="Arial" w:cs="Arial"/>
+          <w:b/>
+          <w:bCs/>
+        </w:rPr>
+      </w:pPr>
+      <w:r>
+        <w:rPr>
+          <w:rFonts w:ascii="Arial" w:hAnsi="Arial" w:cs="Arial"/>
+          <w:b/>
+          <w:bCs/>
+        </w:rPr>
+        <w:t xml:space="preserve">17) R: </w:t>
+      </w:r>
+      <w:r>
+        <w:rPr>
+          <w:rFonts w:ascii="Arial" w:hAnsi="Arial" w:cs="Arial"/>
+        </w:rPr>
+        <w:t>Vídeo no Visual Studio Code</w:t>
+      </w:r>
+      <w:r>
+        <w:rPr>
+          <w:rFonts w:ascii="Arial" w:hAnsi="Arial" w:cs="Arial"/>
+        </w:rPr>
+        <w:t>.</w:t>
+      </w:r>
+    </w:p>
+    <w:p>
+      <w:pPr>
+        <w:jc w:val="both"/>
+        <w:rPr>
+          <w:rFonts w:ascii="Arial" w:hAnsi="Arial" w:cs="Arial"/>
+          <w:b/>
+          <w:bCs/>
+        </w:rPr>
+      </w:pPr>
+    </w:p>
+    <w:p>
+      <w:pPr>
+        <w:jc w:val="both"/>
+        <w:rPr>
+          <w:rFonts w:ascii="Arial" w:hAnsi="Arial" w:cs="Arial"/>
+          <w:b/>
+          <w:bCs/>
+        </w:rPr>
+      </w:pPr>
+      <w:r>
+        <w:rPr>
+          <w:rFonts w:ascii="Arial" w:hAnsi="Arial" w:cs="Arial"/>
+          <w:b/>
+          <w:bCs/>
+        </w:rPr>
+        <w:t>18) O que são sensores de temperatura?</w:t>
+      </w:r>
+      <w:r>
+        <w:rPr>
+          <w:rFonts w:ascii="Arial" w:hAnsi="Arial" w:cs="Arial"/>
+          <w:b/>
+          <w:bCs/>
+        </w:rPr>
+        <w:t xml:space="preserve"> E quais são os tipos de sensores analógicos?</w:t>
+      </w:r>
+    </w:p>
+    <w:p>
+      <w:pPr>
+        <w:spacing w:after="0"/>
+        <w:jc w:val="both"/>
+        <w:rPr>
+          <w:rFonts w:ascii="Arial" w:hAnsi="Arial" w:cs="Arial"/>
+        </w:rPr>
+      </w:pPr>
+      <w:r>
+        <w:rPr>
+          <w:rFonts w:ascii="Arial" w:hAnsi="Arial" w:cs="Arial"/>
+          <w:b/>
+          <w:bCs/>
+        </w:rPr>
+        <w:t xml:space="preserve">18) R: </w:t>
+      </w:r>
+      <w:r>
+        <w:rPr>
+          <w:rFonts w:ascii="Arial" w:hAnsi="Arial" w:cs="Arial"/>
+        </w:rPr>
+        <w:t>Um sensor de temperatura é um dispositivo eletrônico que detecta</w:t>
+      </w:r>
+      <w:r>
+        <w:rPr>
+          <w:rFonts w:ascii="Arial" w:hAnsi="Arial" w:cs="Arial"/>
+        </w:rPr>
+        <w:t xml:space="preserve"> </w:t>
+      </w:r>
+      <w:r>
+        <w:rPr>
+          <w:rFonts w:ascii="Arial" w:hAnsi="Arial" w:cs="Arial"/>
+        </w:rPr>
+        <w:t>variações de calor em um ambiente ou objeto e as converte em sinais elétricos.</w:t>
+      </w:r>
+      <w:r>
+        <w:rPr>
+          <w:rFonts w:ascii="Arial" w:hAnsi="Arial" w:cs="Arial"/>
+        </w:rPr>
+        <w:t xml:space="preserve"> </w:t>
+      </w:r>
+      <w:r>
+        <w:rPr>
+          <w:rFonts w:ascii="Arial" w:hAnsi="Arial" w:cs="Arial"/>
+        </w:rPr>
+        <w:t>Esses sinais são lidos por controladores para monitorar, exibir ou regular processos de aquecimento e resfriamento em aplicações como automóveis, ar-condicionado e equipamentos industriais.</w:t>
+      </w:r>
+    </w:p>
+    <w:p>
+      <w:pPr>
+        <w:spacing w:after="0"/>
+        <w:jc w:val="both"/>
+        <w:rPr>
+          <w:rFonts w:ascii="Arial" w:hAnsi="Arial" w:cs="Arial"/>
+        </w:rPr>
+      </w:pPr>
+    </w:p>
+    <w:p>
+      <w:pPr>
+        <w:spacing w:after="0"/>
+        <w:jc w:val="both"/>
+        <w:rPr>
+          <w:rFonts w:ascii="Arial" w:hAnsi="Arial" w:cs="Arial"/>
+        </w:rPr>
+      </w:pPr>
+      <w:r>
+        <w:rPr>
+          <w:rFonts w:ascii="Arial" w:hAnsi="Arial" w:cs="Arial"/>
+          <w:b/>
+          <w:bCs/>
+        </w:rPr>
+        <w:t xml:space="preserve">NTC (Negative Temperature Coefficient): </w:t>
+      </w:r>
+      <w:r>
+        <w:rPr>
+          <w:rFonts w:ascii="Arial" w:hAnsi="Arial" w:cs="Arial"/>
         </w:rPr>
         <w:t>É</w:t>
       </w:r>
@@ -2858,195 +4061,53 @@
         <w:rPr>
           <w:rFonts w:ascii="Arial" w:hAnsi="Arial" w:cs="Arial"/>
         </w:rPr>
-        <w:t xml:space="preserve"> uma plataforma de prototipagem eletr</w:t>
-      </w:r>
-      <w:r>
-        <w:rPr>
-          <w:rFonts w:ascii="Arial" w:hAnsi="Arial" w:cs="Arial" w:hint="cs"/>
-        </w:rPr>
-        <w:t>ô</w:t>
-      </w:r>
-      <w:r>
-        <w:rPr>
-          <w:rFonts w:ascii="Arial" w:hAnsi="Arial" w:cs="Arial"/>
-        </w:rPr>
-        <w:t>nica de c</w:t>
-      </w:r>
-      <w:r>
-        <w:rPr>
-          <w:rFonts w:ascii="Arial" w:hAnsi="Arial" w:cs="Arial" w:hint="cs"/>
-        </w:rPr>
-        <w:t>ó</w:t>
-      </w:r>
-      <w:r>
-        <w:rPr>
-          <w:rFonts w:ascii="Arial" w:hAnsi="Arial" w:cs="Arial"/>
-        </w:rPr>
-        <w:t>digo aberto que combina hardware (uma placa com um microcontrolador) e software (uma ferramenta de desenvolvimento) para criar projetos interativos de forma acess</w:t>
-      </w:r>
-      <w:r>
-        <w:rPr>
-          <w:rFonts w:ascii="Arial" w:hAnsi="Arial" w:cs="Arial" w:hint="cs"/>
-        </w:rPr>
-        <w:t>í</w:t>
-      </w:r>
-      <w:r>
-        <w:rPr>
-          <w:rFonts w:ascii="Arial" w:hAnsi="Arial" w:cs="Arial"/>
-        </w:rPr>
-        <w:t>vel e simples.</w:t>
-      </w:r>
-    </w:p>
-    <w:p>
-      <w:pPr>
-        <w:jc w:val="both"/>
-        <w:rPr>
-          <w:rFonts w:ascii="Arial" w:hAnsi="Arial" w:cs="Arial"/>
-          <w:b/>
-          <w:bCs/>
-        </w:rPr>
-      </w:pPr>
-    </w:p>
-    <w:p>
-      <w:pPr>
-        <w:jc w:val="both"/>
-        <w:rPr>
-          <w:rFonts w:ascii="Arial" w:hAnsi="Arial" w:cs="Arial"/>
-          <w:b/>
-          <w:bCs/>
-        </w:rPr>
-      </w:pPr>
-      <w:r>
-        <w:rPr>
-          <w:rFonts w:ascii="Arial" w:hAnsi="Arial" w:cs="Arial"/>
-          <w:b/>
-          <w:bCs/>
-        </w:rPr>
-        <w:t xml:space="preserve">11) </w:t>
-      </w:r>
-      <w:r>
-        <w:rPr>
-          <w:rFonts w:ascii="Arial" w:hAnsi="Arial" w:cs="Arial"/>
-          <w:b/>
-          <w:bCs/>
-        </w:rPr>
-        <w:t>Qual é a escala analógica do arduino</w:t>
-      </w:r>
-      <w:r>
-        <w:rPr>
-          <w:rFonts w:ascii="Arial" w:hAnsi="Arial" w:cs="Arial"/>
-          <w:b/>
-          <w:bCs/>
-        </w:rPr>
-        <w:t>?</w:t>
-      </w:r>
-    </w:p>
-    <w:p>
-      <w:pPr>
-        <w:jc w:val="both"/>
-        <w:rPr>
-          <w:rFonts w:ascii="Arial" w:hAnsi="Arial" w:cs="Arial"/>
-        </w:rPr>
-      </w:pPr>
-      <w:r>
-        <w:rPr>
-          <w:rFonts w:ascii="Arial" w:hAnsi="Arial" w:cs="Arial"/>
-          <w:b/>
-          <w:bCs/>
-        </w:rPr>
-        <w:t xml:space="preserve">11) R: </w:t>
-      </w:r>
-      <w:r>
-        <w:rPr>
-          <w:rFonts w:ascii="Arial" w:hAnsi="Arial" w:cs="Arial"/>
-        </w:rPr>
-        <w:t>A escala analógica do Arduino, nas placas mais comuns como Uno, Nano e Mega, possui resolução de 10 bits na entrada, variando de 0 a 1023, representando tensões geralmente entre 0 e 5 volts. Já na saída, os valores variam de 0 a 255, pois é utilizada a técnica de PWM, com resolução de 8 bits.</w:t>
-      </w:r>
-    </w:p>
-    <w:p>
-      <w:pPr>
-        <w:jc w:val="both"/>
-        <w:rPr>
-          <w:rFonts w:ascii="Arial" w:hAnsi="Arial" w:cs="Arial"/>
-          <w:b/>
-          <w:bCs/>
-        </w:rPr>
-      </w:pPr>
-    </w:p>
-    <w:p>
-      <w:pPr>
-        <w:jc w:val="both"/>
-        <w:rPr>
-          <w:rFonts w:ascii="Arial" w:hAnsi="Arial" w:cs="Arial"/>
-          <w:b/>
-          <w:bCs/>
-        </w:rPr>
-      </w:pPr>
-      <w:r>
-        <w:rPr>
-          <w:rFonts w:ascii="Arial" w:hAnsi="Arial" w:cs="Arial"/>
-          <w:b/>
-          <w:bCs/>
-        </w:rPr>
-        <w:t xml:space="preserve">12) </w:t>
-      </w:r>
-      <w:r>
-        <w:rPr>
-          <w:rFonts w:ascii="Arial" w:hAnsi="Arial" w:cs="Arial"/>
-          <w:b/>
-          <w:bCs/>
-        </w:rPr>
-        <w:t>O que é entrada analógica e o que é entrada digital no ardu</w:t>
-      </w:r>
-      <w:r>
-        <w:rPr>
-          <w:rFonts w:ascii="Arial" w:hAnsi="Arial" w:cs="Arial"/>
-          <w:b/>
-          <w:bCs/>
-        </w:rPr>
-        <w:t>i</w:t>
-      </w:r>
-      <w:r>
-        <w:rPr>
-          <w:rFonts w:ascii="Arial" w:hAnsi="Arial" w:cs="Arial"/>
-          <w:b/>
-          <w:bCs/>
-        </w:rPr>
-        <w:t>no?</w:t>
-      </w:r>
-    </w:p>
-    <w:p>
-      <w:pPr>
-        <w:jc w:val="both"/>
-        <w:rPr>
-          <w:rFonts w:ascii="Arial" w:hAnsi="Arial" w:cs="Arial"/>
-        </w:rPr>
-      </w:pPr>
-      <w:r>
-        <w:rPr>
-          <w:rFonts w:ascii="Arial" w:hAnsi="Arial" w:cs="Arial"/>
-          <w:b/>
-          <w:bCs/>
-        </w:rPr>
-        <w:t xml:space="preserve">12) R: </w:t>
-      </w:r>
-      <w:r>
-        <w:rPr>
-          <w:rFonts w:ascii="Arial" w:hAnsi="Arial" w:cs="Arial"/>
-        </w:rPr>
-        <w:t>No Arduino, entrada analógica é o tipo de entrada responsável por ler sinais elétricos contínuos, que variam em uma escala numérica. No Arduino Uno, essa escala vai de 0 a 1023, representando uma variação de tensão de 0</w:t>
-      </w:r>
-      <w:r>
-        <w:rPr>
-          <w:rFonts w:ascii="Arial" w:hAnsi="Arial" w:cs="Arial"/>
-        </w:rPr>
-        <w:t xml:space="preserve"> V</w:t>
-      </w:r>
-      <w:r>
-        <w:rPr>
-          <w:rFonts w:ascii="Arial" w:hAnsi="Arial" w:cs="Arial"/>
-        </w:rPr>
-        <w:t xml:space="preserve"> a 5</w:t>
+        <w:t xml:space="preserve"> um termistor, ou seja, um componente eletrônico cuja resistência elétrica diminui à medida que a temperatura aumenta. São amplamente usados em termostatos, ar-condicionado e eletrônicos para medição precisa de temperatura </w:t>
+      </w:r>
+      <w:r>
+        <w:rPr>
+          <w:rFonts w:ascii="Arial" w:hAnsi="Arial" w:cs="Arial"/>
+          <w:b/>
+          <w:bCs/>
+        </w:rPr>
+        <w:t>(-50°C a 150°C)</w:t>
+      </w:r>
+      <w:r>
+        <w:rPr>
+          <w:rFonts w:ascii="Arial" w:hAnsi="Arial" w:cs="Arial"/>
+        </w:rPr>
+        <w:t xml:space="preserve"> e proteção térmica</w:t>
+      </w:r>
+      <w:r>
+        <w:rPr>
+          <w:rFonts w:ascii="Arial" w:hAnsi="Arial" w:cs="Arial"/>
+        </w:rPr>
+        <w:t>.</w:t>
+      </w:r>
+    </w:p>
+    <w:p>
+      <w:pPr>
+        <w:spacing w:after="0"/>
+        <w:jc w:val="both"/>
+        <w:rPr>
+          <w:rFonts w:ascii="Arial" w:hAnsi="Arial" w:cs="Arial"/>
+        </w:rPr>
+      </w:pPr>
+    </w:p>
+    <w:p>
+      <w:pPr>
+        <w:spacing w:after="0"/>
+        <w:jc w:val="both"/>
+        <w:rPr>
+          <w:rFonts w:ascii="Arial" w:hAnsi="Arial" w:cs="Arial"/>
+        </w:rPr>
+      </w:pPr>
+      <w:r>
+        <w:rPr>
+          <w:rFonts w:ascii="Arial" w:hAnsi="Arial" w:cs="Arial"/>
+          <w:b/>
+          <w:bCs/>
+        </w:rPr>
+        <w:t>Termopar Tipo K:</w:t>
       </w:r>
       <w:r>
         <w:rPr>
@@ -3058,65 +4119,101 @@
         <w:rPr>
           <w:rFonts w:ascii="Arial" w:hAnsi="Arial" w:cs="Arial"/>
         </w:rPr>
-        <w:t>V, permitindo medir mudanças graduais de um fenômeno físico.</w:t>
-      </w:r>
-    </w:p>
-    <w:p>
-      <w:pPr>
-        <w:jc w:val="both"/>
-        <w:rPr>
-          <w:rFonts w:ascii="Arial" w:hAnsi="Arial" w:cs="Arial"/>
-        </w:rPr>
-      </w:pPr>
-    </w:p>
-    <w:p>
-      <w:pPr>
-        <w:jc w:val="both"/>
-        <w:rPr>
-          <w:rFonts w:ascii="Arial" w:hAnsi="Arial" w:cs="Arial"/>
-        </w:rPr>
-      </w:pPr>
-      <w:r>
-        <w:rPr>
-          <w:rFonts w:ascii="Arial" w:hAnsi="Arial" w:cs="Arial"/>
-        </w:rPr>
-        <w:t>Já a entrada digital é a entrada que reconhece apenas dois estados possíveis em sua escala lógica: 0 (LOW</w:t>
-      </w:r>
-      <w:r>
-        <w:rPr>
-          <w:rFonts w:ascii="Arial" w:hAnsi="Arial" w:cs="Arial"/>
-        </w:rPr>
-        <w:t xml:space="preserve"> / 0</w:t>
-      </w:r>
-      <w:r>
-        <w:rPr>
-          <w:rFonts w:ascii="Arial" w:hAnsi="Arial" w:cs="Arial"/>
-        </w:rPr>
-        <w:t xml:space="preserve"> </w:t>
-      </w:r>
-      <w:r>
-        <w:rPr>
-          <w:rFonts w:ascii="Arial" w:hAnsi="Arial" w:cs="Arial"/>
-        </w:rPr>
-        <w:t>V</w:t>
-      </w:r>
-      <w:r>
-        <w:rPr>
-          <w:rFonts w:ascii="Arial" w:hAnsi="Arial" w:cs="Arial"/>
-        </w:rPr>
-        <w:t>) para nível baixo e 1 (HIGH</w:t>
-      </w:r>
-      <w:r>
-        <w:rPr>
-          <w:rFonts w:ascii="Arial" w:hAnsi="Arial" w:cs="Arial"/>
-        </w:rPr>
-        <w:t xml:space="preserve"> / 5 V</w:t>
-      </w:r>
-      <w:r>
-        <w:rPr>
-          <w:rFonts w:ascii="Arial" w:hAnsi="Arial" w:cs="Arial"/>
-        </w:rPr>
-        <w:t>) para nível alto</w:t>
+        <w:t>É</w:t>
+      </w:r>
+      <w:r>
+        <w:rPr>
+          <w:rFonts w:ascii="Arial" w:hAnsi="Arial" w:cs="Arial"/>
+        </w:rPr>
+        <w:t xml:space="preserve"> um sensor industrial popular e de baixo custo, composto por fios de Cromel (níquel-cromo) e Alumel (níquel-alumínio), ideal para altas temperaturas </w:t>
+      </w:r>
+      <w:r>
+        <w:rPr>
+          <w:rFonts w:ascii="Arial" w:hAnsi="Arial" w:cs="Arial"/>
+          <w:b/>
+          <w:bCs/>
+        </w:rPr>
+        <w:t>(-200</w:t>
+      </w:r>
+      <w:r>
+        <w:rPr>
+          <w:rFonts w:ascii="Arial" w:hAnsi="Arial" w:cs="Arial" w:hint="cs"/>
+          <w:b/>
+          <w:bCs/>
+        </w:rPr>
+        <w:t>°</w:t>
+      </w:r>
+      <w:r>
+        <w:rPr>
+          <w:rFonts w:ascii="Arial" w:hAnsi="Arial" w:cs="Arial"/>
+          <w:b/>
+          <w:bCs/>
+        </w:rPr>
+        <w:t xml:space="preserve">C a </w:t>
+      </w:r>
+      <w:r>
+        <w:rPr>
+          <w:rFonts w:ascii="Arial" w:hAnsi="Arial" w:cs="Arial"/>
+          <w:b/>
+          <w:bCs/>
+        </w:rPr>
+        <w:t>1250</w:t>
+      </w:r>
+      <w:r>
+        <w:rPr>
+          <w:rFonts w:ascii="Arial" w:hAnsi="Arial" w:cs="Arial" w:hint="cs"/>
+          <w:b/>
+          <w:bCs/>
+        </w:rPr>
+        <w:t>°</w:t>
+      </w:r>
+      <w:r>
+        <w:rPr>
+          <w:rFonts w:ascii="Arial" w:hAnsi="Arial" w:cs="Arial"/>
+          <w:b/>
+          <w:bCs/>
+        </w:rPr>
+        <w:t>C</w:t>
+      </w:r>
+      <w:r>
+        <w:rPr>
+          <w:rFonts w:ascii="Arial" w:hAnsi="Arial" w:cs="Arial"/>
+          <w:b/>
+          <w:bCs/>
+        </w:rPr>
+        <w:t xml:space="preserve"> ou até </w:t>
+      </w:r>
+      <w:r>
+        <w:rPr>
+          <w:rFonts w:ascii="Arial" w:hAnsi="Arial" w:cs="Arial"/>
+          <w:b/>
+          <w:bCs/>
+        </w:rPr>
+        <w:t>1372</w:t>
+      </w:r>
+      <w:r>
+        <w:rPr>
+          <w:rFonts w:ascii="Arial" w:hAnsi="Arial" w:cs="Arial" w:hint="cs"/>
+          <w:b/>
+          <w:bCs/>
+        </w:rPr>
+        <w:t>°</w:t>
+      </w:r>
+      <w:r>
+        <w:rPr>
+          <w:rFonts w:ascii="Arial" w:hAnsi="Arial" w:cs="Arial"/>
+          <w:b/>
+          <w:bCs/>
+        </w:rPr>
+        <w:t>C</w:t>
+      </w:r>
+      <w:r>
+        <w:rPr>
+          <w:rFonts w:ascii="Arial" w:hAnsi="Arial" w:cs="Arial"/>
+          <w:b/>
+          <w:bCs/>
+        </w:rPr>
+        <w:t>)</w:t>
       </w:r>
       <w:r>
         <w:rPr>
@@ -3130,1109 +4227,6 @@
         <w:jc w:val="both"/>
         <w:rPr>
           <w:rFonts w:ascii="Arial" w:hAnsi="Arial" w:cs="Arial"/>
-        </w:rPr>
-      </w:pPr>
-    </w:p>
-    <w:p>
-      <w:pPr>
-        <w:jc w:val="both"/>
-        <w:rPr>
-          <w:rFonts w:ascii="Arial" w:hAnsi="Arial" w:cs="Arial"/>
-          <w:b/>
-          <w:bCs/>
-        </w:rPr>
-      </w:pPr>
-      <w:r>
-        <w:rPr>
-          <w:rFonts w:ascii="Arial" w:hAnsi="Arial" w:cs="Arial"/>
-          <w:b/>
-          <w:bCs/>
-        </w:rPr>
-        <w:t>12.1) O que é saída analógica (PWM) ardu</w:t>
-      </w:r>
-      <w:r>
-        <w:rPr>
-          <w:rFonts w:ascii="Arial" w:hAnsi="Arial" w:cs="Arial"/>
-          <w:b/>
-          <w:bCs/>
-        </w:rPr>
-        <w:t>i</w:t>
-      </w:r>
-      <w:r>
-        <w:rPr>
-          <w:rFonts w:ascii="Arial" w:hAnsi="Arial" w:cs="Arial"/>
-          <w:b/>
-          <w:bCs/>
-        </w:rPr>
-        <w:t>no?</w:t>
-      </w:r>
-    </w:p>
-    <w:p>
-      <w:pPr>
-        <w:jc w:val="both"/>
-        <w:rPr>
-          <w:rFonts w:ascii="Arial" w:hAnsi="Arial" w:cs="Arial"/>
-        </w:rPr>
-      </w:pPr>
-      <w:r>
-        <w:rPr>
-          <w:rFonts w:ascii="Arial" w:hAnsi="Arial" w:cs="Arial"/>
-          <w:b/>
-          <w:bCs/>
-        </w:rPr>
-        <w:t xml:space="preserve">12.1) R: </w:t>
-      </w:r>
-      <w:r>
-        <w:rPr>
-          <w:rFonts w:ascii="Arial" w:hAnsi="Arial" w:cs="Arial"/>
-        </w:rPr>
-        <w:t>A saída analógica do Arduino refere-se ao PWM (Modulação por Largura de Pulso). Nesse método, o sinal não é contínuo, mas sim digital, alternando rapidamente entre ligado e desligado. A variação do tempo em que o sinal permanece ligado permite simular diferentes níveis de tensão média.</w:t>
-      </w:r>
-    </w:p>
-    <w:p>
-      <w:pPr>
-        <w:jc w:val="both"/>
-        <w:rPr>
-          <w:rFonts w:ascii="Arial" w:hAnsi="Arial" w:cs="Arial"/>
-          <w:b/>
-          <w:bCs/>
-        </w:rPr>
-      </w:pPr>
-      <w:r>
-        <w:rPr>
-          <w:rFonts w:ascii="Arial" w:hAnsi="Arial" w:cs="Arial"/>
-          <w:b/>
-          <w:bCs/>
-        </w:rPr>
-        <w:t xml:space="preserve"> </w:t>
-      </w:r>
-    </w:p>
-    <w:p>
-      <w:pPr>
-        <w:jc w:val="both"/>
-        <w:rPr>
-          <w:rFonts w:ascii="Arial" w:hAnsi="Arial" w:cs="Arial"/>
-          <w:b/>
-          <w:bCs/>
-        </w:rPr>
-      </w:pPr>
-      <w:r>
-        <w:rPr>
-          <w:rFonts w:ascii="Arial" w:hAnsi="Arial" w:cs="Arial"/>
-          <w:b/>
-          <w:bCs/>
-        </w:rPr>
-        <w:t xml:space="preserve">13) </w:t>
-      </w:r>
-      <w:r>
-        <w:rPr>
-          <w:rFonts w:ascii="Arial" w:hAnsi="Arial" w:cs="Arial"/>
-          <w:b/>
-          <w:bCs/>
-        </w:rPr>
-        <w:t>O que é o CLP?</w:t>
-      </w:r>
-      <w:r>
-        <w:rPr>
-          <w:rFonts w:ascii="Arial" w:hAnsi="Arial" w:cs="Arial"/>
-          <w:b/>
-          <w:bCs/>
-        </w:rPr>
-        <w:t xml:space="preserve"> </w:t>
-      </w:r>
-      <w:r>
-        <w:rPr>
-          <w:rFonts w:ascii="Arial" w:hAnsi="Arial" w:cs="Arial"/>
-          <w:b/>
-          <w:bCs/>
-        </w:rPr>
-        <w:t>(Modelo da CPU 1214c do tipo DC/DC/DC)</w:t>
-      </w:r>
-      <w:r>
-        <w:rPr>
-          <w:rFonts w:ascii="Arial" w:hAnsi="Arial" w:cs="Arial"/>
-          <w:b/>
-          <w:bCs/>
-        </w:rPr>
-        <w:t>.</w:t>
-      </w:r>
-    </w:p>
-    <w:p>
-      <w:pPr>
-        <w:jc w:val="both"/>
-        <w:rPr>
-          <w:rFonts w:ascii="Arial" w:hAnsi="Arial" w:cs="Arial"/>
-        </w:rPr>
-      </w:pPr>
-      <w:r>
-        <w:rPr>
-          <w:rFonts w:ascii="Arial" w:hAnsi="Arial" w:cs="Arial"/>
-          <w:b/>
-          <w:bCs/>
-        </w:rPr>
-        <w:t xml:space="preserve">13) R: </w:t>
-      </w:r>
-      <w:r>
-        <w:rPr>
-          <w:rFonts w:ascii="Arial" w:hAnsi="Arial" w:cs="Arial"/>
-        </w:rPr>
-        <w:t xml:space="preserve">O CLP (Controlador Lógico Programável) é um equipamento eletrônico industrial projetado para automatizar e controlar máquinas e processos. Ele é composto por hardware robusto, capaz de operar em ambientes industriais, e </w:t>
-      </w:r>
-      <w:r>
-        <w:rPr>
-          <w:rFonts w:ascii="Arial" w:hAnsi="Arial" w:cs="Arial"/>
-        </w:rPr>
-        <w:lastRenderedPageBreak/>
-        <w:t>por software de programação, usado para criar lógicas de controle baseadas em entradas e saídas. Seu objetivo principal é executar comandos de forma confiável, contínua e segura, substituindo sistemas antigos baseados em relés e temporizadores eletromecânicos.</w:t>
-      </w:r>
-    </w:p>
-    <w:p>
-      <w:pPr>
-        <w:jc w:val="both"/>
-        <w:rPr>
-          <w:rFonts w:ascii="Arial" w:hAnsi="Arial" w:cs="Arial"/>
-        </w:rPr>
-      </w:pPr>
-    </w:p>
-    <w:p>
-      <w:pPr>
-        <w:jc w:val="both"/>
-        <w:rPr>
-          <w:rFonts w:ascii="Arial" w:hAnsi="Arial" w:cs="Arial"/>
-          <w:b/>
-          <w:bCs/>
-        </w:rPr>
-      </w:pPr>
-      <w:r>
-        <w:rPr>
-          <w:rFonts w:ascii="Arial" w:hAnsi="Arial" w:cs="Arial"/>
-          <w:b/>
-          <w:bCs/>
-        </w:rPr>
-        <w:t xml:space="preserve">13.1) </w:t>
-      </w:r>
-      <w:r>
-        <w:rPr>
-          <w:rFonts w:ascii="Arial" w:hAnsi="Arial" w:cs="Arial"/>
-          <w:b/>
-          <w:bCs/>
-        </w:rPr>
-        <w:t>Qual é a e</w:t>
-      </w:r>
-      <w:r>
-        <w:rPr>
-          <w:rFonts w:ascii="Arial" w:hAnsi="Arial" w:cs="Arial"/>
-          <w:b/>
-          <w:bCs/>
-        </w:rPr>
-        <w:t xml:space="preserve">scala analógica </w:t>
-      </w:r>
-      <w:r>
-        <w:rPr>
-          <w:rFonts w:ascii="Arial" w:hAnsi="Arial" w:cs="Arial"/>
-          <w:b/>
-          <w:bCs/>
-        </w:rPr>
-        <w:t>n</w:t>
-      </w:r>
-      <w:r>
-        <w:rPr>
-          <w:rFonts w:ascii="Arial" w:hAnsi="Arial" w:cs="Arial"/>
-          <w:b/>
-          <w:bCs/>
-        </w:rPr>
-        <w:t>o CLP</w:t>
-      </w:r>
-      <w:r>
-        <w:rPr>
-          <w:rFonts w:ascii="Arial" w:hAnsi="Arial" w:cs="Arial"/>
-          <w:b/>
-          <w:bCs/>
-        </w:rPr>
-        <w:t>?</w:t>
-      </w:r>
-    </w:p>
-    <w:p>
-      <w:pPr>
-        <w:jc w:val="both"/>
-        <w:rPr>
-          <w:rFonts w:ascii="Arial" w:hAnsi="Arial" w:cs="Arial"/>
-          <w:b/>
-          <w:bCs/>
-        </w:rPr>
-      </w:pPr>
-      <w:r>
-        <w:rPr>
-          <w:rFonts w:ascii="Arial" w:hAnsi="Arial" w:cs="Arial"/>
-          <w:b/>
-          <w:bCs/>
-        </w:rPr>
-        <w:t xml:space="preserve">13.1) R: </w:t>
-      </w:r>
-      <w:r>
-        <w:rPr>
-          <w:rFonts w:ascii="Arial" w:hAnsi="Arial" w:cs="Arial"/>
-        </w:rPr>
-        <w:t>A escala analógica em CLPs representa sinais contínuos, como 0 a 10</w:t>
-      </w:r>
-      <w:r>
-        <w:rPr>
-          <w:rFonts w:ascii="Arial" w:hAnsi="Arial" w:cs="Arial"/>
-        </w:rPr>
-        <w:t xml:space="preserve"> </w:t>
-      </w:r>
-      <w:r>
-        <w:rPr>
-          <w:rFonts w:ascii="Arial" w:hAnsi="Arial" w:cs="Arial"/>
-        </w:rPr>
-        <w:t>V ou 4 a 20 mA, convertidos em valores digitais internos. Geralmente, essa conversão ocorre em uma faixa como 0 a 27648 para 0–10</w:t>
-      </w:r>
-      <w:r>
-        <w:rPr>
-          <w:rFonts w:ascii="Arial" w:hAnsi="Arial" w:cs="Arial"/>
-        </w:rPr>
-        <w:t xml:space="preserve"> </w:t>
-      </w:r>
-      <w:r>
-        <w:rPr>
-          <w:rFonts w:ascii="Arial" w:hAnsi="Arial" w:cs="Arial"/>
-        </w:rPr>
-        <w:t>V, ou aproximadamente 5530 a 27648 para 4–20 mA, permitindo que o CLP processe os sinais com precisão.</w:t>
-      </w:r>
-    </w:p>
-    <w:p>
-      <w:pPr>
-        <w:jc w:val="both"/>
-        <w:rPr>
-          <w:rFonts w:ascii="Arial" w:hAnsi="Arial" w:cs="Arial"/>
-          <w:b/>
-          <w:bCs/>
-        </w:rPr>
-      </w:pPr>
-    </w:p>
-    <w:p>
-      <w:pPr>
-        <w:jc w:val="both"/>
-        <w:rPr>
-          <w:rFonts w:ascii="Arial" w:hAnsi="Arial" w:cs="Arial"/>
-          <w:b/>
-          <w:bCs/>
-        </w:rPr>
-      </w:pPr>
-      <w:r>
-        <w:rPr>
-          <w:rFonts w:ascii="Arial" w:hAnsi="Arial" w:cs="Arial"/>
-          <w:b/>
-          <w:bCs/>
-        </w:rPr>
-        <w:t xml:space="preserve">14) </w:t>
-      </w:r>
-      <w:r>
-        <w:rPr>
-          <w:rFonts w:ascii="Arial" w:hAnsi="Arial" w:cs="Arial"/>
-          <w:b/>
-          <w:bCs/>
-        </w:rPr>
-        <w:t>O que é entrada analógica e o que é entrada digital no CLP?</w:t>
-      </w:r>
-    </w:p>
-    <w:p>
-      <w:pPr>
-        <w:jc w:val="both"/>
-        <w:rPr>
-          <w:rFonts w:ascii="Arial" w:hAnsi="Arial" w:cs="Arial"/>
-        </w:rPr>
-      </w:pPr>
-      <w:r>
-        <w:rPr>
-          <w:rFonts w:ascii="Arial" w:hAnsi="Arial" w:cs="Arial"/>
-          <w:b/>
-          <w:bCs/>
-        </w:rPr>
-        <w:t xml:space="preserve">14) R: </w:t>
-      </w:r>
-      <w:r>
-        <w:rPr>
-          <w:rFonts w:ascii="Arial" w:hAnsi="Arial" w:cs="Arial"/>
-        </w:rPr>
-        <w:t>Em um CLP, a entrada anal</w:t>
-      </w:r>
-      <w:r>
-        <w:rPr>
-          <w:rFonts w:ascii="Arial" w:hAnsi="Arial" w:cs="Arial" w:hint="cs"/>
-        </w:rPr>
-        <w:t>ó</w:t>
-      </w:r>
-      <w:r>
-        <w:rPr>
-          <w:rFonts w:ascii="Arial" w:hAnsi="Arial" w:cs="Arial"/>
-        </w:rPr>
-        <w:t xml:space="preserve">gica </w:t>
-      </w:r>
-      <w:r>
-        <w:rPr>
-          <w:rFonts w:ascii="Arial" w:hAnsi="Arial" w:cs="Arial" w:hint="cs"/>
-        </w:rPr>
-        <w:t>é</w:t>
-      </w:r>
-      <w:r>
-        <w:rPr>
-          <w:rFonts w:ascii="Arial" w:hAnsi="Arial" w:cs="Arial"/>
-        </w:rPr>
-        <w:t xml:space="preserve"> utilizada para ler sinais cont</w:t>
-      </w:r>
-      <w:r>
-        <w:rPr>
-          <w:rFonts w:ascii="Arial" w:hAnsi="Arial" w:cs="Arial" w:hint="cs"/>
-        </w:rPr>
-        <w:t>í</w:t>
-      </w:r>
-      <w:r>
-        <w:rPr>
-          <w:rFonts w:ascii="Arial" w:hAnsi="Arial" w:cs="Arial"/>
-        </w:rPr>
-        <w:t xml:space="preserve">nuos provenientes de sensores industriais. Ela trabalha com escalas padronizadas, como 0 a 10 V, </w:t>
-      </w:r>
-      <w:r>
-        <w:rPr>
-          <w:rFonts w:ascii="Arial" w:hAnsi="Arial" w:cs="Arial" w:hint="cs"/>
-        </w:rPr>
-        <w:t>±</w:t>
-      </w:r>
-      <w:r>
-        <w:rPr>
-          <w:rFonts w:ascii="Arial" w:hAnsi="Arial" w:cs="Arial"/>
-        </w:rPr>
-        <w:t>10 V ou 4 a 20 mA, convertendo esses valores el</w:t>
-      </w:r>
-      <w:r>
-        <w:rPr>
-          <w:rFonts w:ascii="Arial" w:hAnsi="Arial" w:cs="Arial" w:hint="cs"/>
-        </w:rPr>
-        <w:t>é</w:t>
-      </w:r>
-      <w:r>
-        <w:rPr>
-          <w:rFonts w:ascii="Arial" w:hAnsi="Arial" w:cs="Arial"/>
-        </w:rPr>
-        <w:t>tricos em n</w:t>
-      </w:r>
-      <w:r>
-        <w:rPr>
-          <w:rFonts w:ascii="Arial" w:hAnsi="Arial" w:cs="Arial" w:hint="cs"/>
-        </w:rPr>
-        <w:t>ú</w:t>
-      </w:r>
-      <w:r>
-        <w:rPr>
-          <w:rFonts w:ascii="Arial" w:hAnsi="Arial" w:cs="Arial"/>
-        </w:rPr>
-        <w:t>meros que representam varia</w:t>
-      </w:r>
-      <w:r>
-        <w:rPr>
-          <w:rFonts w:ascii="Arial" w:hAnsi="Arial" w:cs="Arial" w:hint="cs"/>
-        </w:rPr>
-        <w:t>çõ</w:t>
-      </w:r>
-      <w:r>
-        <w:rPr>
-          <w:rFonts w:ascii="Arial" w:hAnsi="Arial" w:cs="Arial"/>
-        </w:rPr>
-        <w:t>es graduais de grandezas f</w:t>
-      </w:r>
-      <w:r>
-        <w:rPr>
-          <w:rFonts w:ascii="Arial" w:hAnsi="Arial" w:cs="Arial" w:hint="cs"/>
-        </w:rPr>
-        <w:t>í</w:t>
-      </w:r>
-      <w:r>
-        <w:rPr>
-          <w:rFonts w:ascii="Arial" w:hAnsi="Arial" w:cs="Arial"/>
-        </w:rPr>
-        <w:t>sicas, como temperatura, press</w:t>
-      </w:r>
-      <w:r>
-        <w:rPr>
-          <w:rFonts w:ascii="Arial" w:hAnsi="Arial" w:cs="Arial" w:hint="cs"/>
-        </w:rPr>
-        <w:t>ã</w:t>
-      </w:r>
-      <w:r>
-        <w:rPr>
-          <w:rFonts w:ascii="Arial" w:hAnsi="Arial" w:cs="Arial"/>
-        </w:rPr>
-        <w:t>o ou n</w:t>
-      </w:r>
-      <w:r>
-        <w:rPr>
-          <w:rFonts w:ascii="Arial" w:hAnsi="Arial" w:cs="Arial" w:hint="cs"/>
-        </w:rPr>
-        <w:t>í</w:t>
-      </w:r>
-      <w:r>
-        <w:rPr>
-          <w:rFonts w:ascii="Arial" w:hAnsi="Arial" w:cs="Arial"/>
-        </w:rPr>
-        <w:t>vel.</w:t>
-      </w:r>
-    </w:p>
-    <w:p>
-      <w:pPr>
-        <w:jc w:val="both"/>
-        <w:rPr>
-          <w:rFonts w:ascii="Arial" w:hAnsi="Arial" w:cs="Arial"/>
-        </w:rPr>
-      </w:pPr>
-    </w:p>
-    <w:p>
-      <w:pPr>
-        <w:jc w:val="both"/>
-        <w:rPr>
-          <w:rFonts w:ascii="Arial" w:hAnsi="Arial" w:cs="Arial"/>
-        </w:rPr>
-      </w:pPr>
-      <w:r>
-        <w:rPr>
-          <w:rFonts w:ascii="Arial" w:hAnsi="Arial" w:cs="Arial"/>
-        </w:rPr>
-        <w:t>J</w:t>
-      </w:r>
-      <w:r>
-        <w:rPr>
-          <w:rFonts w:ascii="Arial" w:hAnsi="Arial" w:cs="Arial" w:hint="cs"/>
-        </w:rPr>
-        <w:t>á</w:t>
-      </w:r>
-      <w:r>
-        <w:rPr>
-          <w:rFonts w:ascii="Arial" w:hAnsi="Arial" w:cs="Arial"/>
-        </w:rPr>
-        <w:t xml:space="preserve"> a entrada digital em um CLP reconhece apenas dois estados l</w:t>
-      </w:r>
-      <w:r>
-        <w:rPr>
-          <w:rFonts w:ascii="Arial" w:hAnsi="Arial" w:cs="Arial" w:hint="cs"/>
-        </w:rPr>
-        <w:t>ó</w:t>
-      </w:r>
-      <w:r>
-        <w:rPr>
-          <w:rFonts w:ascii="Arial" w:hAnsi="Arial" w:cs="Arial"/>
-        </w:rPr>
-        <w:t>gicos em sua escala: 0 ou 1, correspondendo a sinais desligado/ligado. Normalmente esses estados s</w:t>
-      </w:r>
-      <w:r>
-        <w:rPr>
-          <w:rFonts w:ascii="Arial" w:hAnsi="Arial" w:cs="Arial" w:hint="cs"/>
-        </w:rPr>
-        <w:t>ã</w:t>
-      </w:r>
-      <w:r>
-        <w:rPr>
-          <w:rFonts w:ascii="Arial" w:hAnsi="Arial" w:cs="Arial"/>
-        </w:rPr>
-        <w:t>o representados por tens</w:t>
-      </w:r>
-      <w:r>
-        <w:rPr>
-          <w:rFonts w:ascii="Arial" w:hAnsi="Arial" w:cs="Arial" w:hint="cs"/>
-        </w:rPr>
-        <w:t>õ</w:t>
-      </w:r>
-      <w:r>
-        <w:rPr>
-          <w:rFonts w:ascii="Arial" w:hAnsi="Arial" w:cs="Arial"/>
-        </w:rPr>
-        <w:t>es industriais, como 0 V e 24 V, sendo usadas para dispositivos como bot</w:t>
-      </w:r>
-      <w:r>
-        <w:rPr>
-          <w:rFonts w:ascii="Arial" w:hAnsi="Arial" w:cs="Arial" w:hint="cs"/>
-        </w:rPr>
-        <w:t>õ</w:t>
-      </w:r>
-      <w:r>
-        <w:rPr>
-          <w:rFonts w:ascii="Arial" w:hAnsi="Arial" w:cs="Arial"/>
-        </w:rPr>
-        <w:t>es, chaves, sensores de fim de curso e rel</w:t>
-      </w:r>
-      <w:r>
-        <w:rPr>
-          <w:rFonts w:ascii="Arial" w:hAnsi="Arial" w:cs="Arial" w:hint="cs"/>
-        </w:rPr>
-        <w:t>é</w:t>
-      </w:r>
-      <w:r>
-        <w:rPr>
-          <w:rFonts w:ascii="Arial" w:hAnsi="Arial" w:cs="Arial"/>
-        </w:rPr>
-        <w:t>s.</w:t>
-      </w:r>
-    </w:p>
-    <w:p>
-      <w:pPr>
-        <w:jc w:val="both"/>
-        <w:rPr>
-          <w:rFonts w:ascii="Arial" w:hAnsi="Arial" w:cs="Arial"/>
-        </w:rPr>
-      </w:pPr>
-    </w:p>
-    <w:p>
-      <w:pPr>
-        <w:jc w:val="both"/>
-        <w:rPr>
-          <w:rFonts w:ascii="Arial" w:hAnsi="Arial" w:cs="Arial"/>
-          <w:b/>
-          <w:bCs/>
-        </w:rPr>
-      </w:pPr>
-      <w:r>
-        <w:rPr>
-          <w:rFonts w:ascii="Arial" w:hAnsi="Arial" w:cs="Arial"/>
-          <w:b/>
-          <w:bCs/>
-        </w:rPr>
-        <w:t>1</w:t>
-      </w:r>
-      <w:r>
-        <w:rPr>
-          <w:rFonts w:ascii="Arial" w:hAnsi="Arial" w:cs="Arial"/>
-          <w:b/>
-          <w:bCs/>
-        </w:rPr>
-        <w:t>4</w:t>
-      </w:r>
-      <w:r>
-        <w:rPr>
-          <w:rFonts w:ascii="Arial" w:hAnsi="Arial" w:cs="Arial"/>
-          <w:b/>
-          <w:bCs/>
-        </w:rPr>
-        <w:t>.1) O que é saída analógica no CLP?</w:t>
-      </w:r>
-    </w:p>
-    <w:p>
-      <w:pPr>
-        <w:jc w:val="both"/>
-        <w:rPr>
-          <w:rFonts w:ascii="Arial" w:hAnsi="Arial" w:cs="Arial"/>
-          <w:b/>
-          <w:bCs/>
-        </w:rPr>
-      </w:pPr>
-      <w:r>
-        <w:rPr>
-          <w:rFonts w:ascii="Arial" w:hAnsi="Arial" w:cs="Arial"/>
-          <w:b/>
-          <w:bCs/>
-        </w:rPr>
-        <w:t xml:space="preserve">14.1) R: </w:t>
-      </w:r>
-      <w:r>
-        <w:rPr>
-          <w:rFonts w:ascii="Arial" w:hAnsi="Arial" w:cs="Arial"/>
-        </w:rPr>
-        <w:t>A saída analógica no CLP é um sinal contínuo e real, diferente do Arduino. Ela pode fornecer diretamente valores de tensão (0 a 10</w:t>
-      </w:r>
-      <w:r>
-        <w:rPr>
-          <w:rFonts w:ascii="Arial" w:hAnsi="Arial" w:cs="Arial"/>
-        </w:rPr>
-        <w:t xml:space="preserve"> </w:t>
-      </w:r>
-      <w:r>
-        <w:rPr>
-          <w:rFonts w:ascii="Arial" w:hAnsi="Arial" w:cs="Arial"/>
-        </w:rPr>
-        <w:t>V) ou corrente (4 a 20 mA), sendo utilizada no controle de equipamentos industriais, como motores, válvulas e inversores de frequência.</w:t>
-      </w:r>
-    </w:p>
-    <w:p>
-      <w:pPr>
-        <w:jc w:val="both"/>
-        <w:rPr>
-          <w:rFonts w:ascii="Arial" w:hAnsi="Arial" w:cs="Arial"/>
-          <w:b/>
-          <w:bCs/>
-        </w:rPr>
-      </w:pPr>
-    </w:p>
-    <w:p>
-      <w:pPr>
-        <w:jc w:val="both"/>
-        <w:rPr>
-          <w:rFonts w:ascii="Arial" w:hAnsi="Arial" w:cs="Arial"/>
-          <w:b/>
-          <w:bCs/>
-        </w:rPr>
-      </w:pPr>
-      <w:r>
-        <w:rPr>
-          <w:rFonts w:ascii="Arial" w:hAnsi="Arial" w:cs="Arial"/>
-          <w:b/>
-          <w:bCs/>
-        </w:rPr>
-        <w:t xml:space="preserve">15) </w:t>
-      </w:r>
-      <w:r>
-        <w:rPr>
-          <w:rFonts w:ascii="Arial" w:hAnsi="Arial" w:cs="Arial"/>
-          <w:b/>
-          <w:bCs/>
-        </w:rPr>
-        <w:t xml:space="preserve">O que é a Ponte de Wheatstone? </w:t>
-      </w:r>
-    </w:p>
-    <w:p>
-      <w:pPr>
-        <w:jc w:val="both"/>
-        <w:rPr>
-          <w:rFonts w:ascii="Arial" w:hAnsi="Arial" w:cs="Arial"/>
-          <w:b/>
-          <w:bCs/>
-        </w:rPr>
-      </w:pPr>
-      <w:r>
-        <w:rPr>
-          <w:rFonts w:ascii="Arial" w:hAnsi="Arial" w:cs="Arial"/>
-          <w:b/>
-          <w:bCs/>
-        </w:rPr>
-        <w:t xml:space="preserve">15) R: </w:t>
-      </w:r>
-      <w:r>
-        <w:rPr>
-          <w:rFonts w:ascii="Arial" w:hAnsi="Arial" w:cs="Arial"/>
-        </w:rPr>
-        <w:t>A Ponte de Wheatstone é um circuito elétrico usado para medir resistências elétricas desconhecidas com alta precisão, muito aplicad</w:t>
-      </w:r>
-      <w:r>
-        <w:rPr>
-          <w:rFonts w:ascii="Arial" w:hAnsi="Arial" w:cs="Arial"/>
-        </w:rPr>
-        <w:t>a</w:t>
-      </w:r>
-      <w:r>
-        <w:rPr>
-          <w:rFonts w:ascii="Arial" w:hAnsi="Arial" w:cs="Arial"/>
-        </w:rPr>
-        <w:t xml:space="preserve"> em sensores e instrumentação. Foi inventada por Samuel Hunter Christie em 1833 e popularizada por Charles Wheatstone em 1843. O circuito é composto por quatro resistores em formato de losango, uma fonte de tensão e um detector </w:t>
-      </w:r>
-      <w:r>
-        <w:rPr>
-          <w:rFonts w:ascii="Arial" w:hAnsi="Arial" w:cs="Arial"/>
-        </w:rPr>
-        <w:lastRenderedPageBreak/>
-        <w:t>central (galvanômetro), permitindo determinar com exatidão o valor da resistência medida quando a ponte está em equilíbrio.</w:t>
-      </w:r>
-    </w:p>
-    <w:p>
-      <w:pPr>
-        <w:jc w:val="both"/>
-        <w:rPr>
-          <w:rFonts w:ascii="Arial" w:hAnsi="Arial" w:cs="Arial"/>
-          <w:b/>
-          <w:bCs/>
-        </w:rPr>
-      </w:pPr>
-    </w:p>
-    <w:p>
-      <w:pPr>
-        <w:jc w:val="both"/>
-        <w:rPr>
-          <w:rFonts w:ascii="Arial" w:hAnsi="Arial" w:cs="Arial"/>
-          <w:b/>
-          <w:bCs/>
-        </w:rPr>
-      </w:pPr>
-      <w:r>
-        <w:rPr>
-          <w:rFonts w:ascii="Arial" w:hAnsi="Arial" w:cs="Arial"/>
-          <w:b/>
-          <w:bCs/>
-        </w:rPr>
-        <w:t xml:space="preserve">16) </w:t>
-      </w:r>
-      <w:r>
-        <w:rPr>
-          <w:rFonts w:ascii="Arial" w:hAnsi="Arial" w:cs="Arial"/>
-          <w:b/>
-          <w:bCs/>
-        </w:rPr>
-        <w:t xml:space="preserve">O que é multímetro? </w:t>
-      </w:r>
-    </w:p>
-    <w:p>
-      <w:pPr>
-        <w:jc w:val="both"/>
-        <w:rPr>
-          <w:rFonts w:ascii="Arial" w:hAnsi="Arial" w:cs="Arial"/>
-        </w:rPr>
-      </w:pPr>
-      <w:r>
-        <w:rPr>
-          <w:rFonts w:ascii="Arial" w:hAnsi="Arial" w:cs="Arial"/>
-          <w:b/>
-          <w:bCs/>
-        </w:rPr>
-        <w:t>16) R:</w:t>
-      </w:r>
-      <w:r>
-        <w:rPr>
-          <w:rFonts w:ascii="Arial" w:hAnsi="Arial" w:cs="Arial"/>
-          <w:b/>
-          <w:bCs/>
-        </w:rPr>
-        <w:t xml:space="preserve"> </w:t>
-      </w:r>
-      <w:r>
-        <w:rPr>
-          <w:rFonts w:ascii="Arial" w:hAnsi="Arial" w:cs="Arial"/>
-        </w:rPr>
-        <w:t>É um instrumento de medição portátil usado para medir grandezas elétricas como tensão (voltagem), corrente (amperagem) e resistência (ohms).</w:t>
-      </w:r>
-    </w:p>
-    <w:p>
-      <w:pPr>
-        <w:jc w:val="both"/>
-        <w:rPr>
-          <w:rFonts w:ascii="Arial" w:hAnsi="Arial" w:cs="Arial"/>
-          <w:b/>
-          <w:bCs/>
-        </w:rPr>
-      </w:pPr>
-    </w:p>
-    <w:p>
-      <w:pPr>
-        <w:jc w:val="both"/>
-        <w:rPr>
-          <w:rFonts w:ascii="Arial" w:hAnsi="Arial" w:cs="Arial"/>
-          <w:b/>
-          <w:bCs/>
-        </w:rPr>
-      </w:pPr>
-      <w:r>
-        <w:rPr>
-          <w:rFonts w:ascii="Arial" w:hAnsi="Arial" w:cs="Arial"/>
-          <w:b/>
-          <w:bCs/>
-        </w:rPr>
-        <w:t xml:space="preserve">17) </w:t>
-      </w:r>
-      <w:r>
-        <w:rPr>
-          <w:rFonts w:ascii="Arial" w:hAnsi="Arial" w:cs="Arial"/>
-          <w:b/>
-          <w:bCs/>
-        </w:rPr>
-        <w:t>Exemplo de medição em mili volts do termopar Tipo K</w:t>
-      </w:r>
-    </w:p>
-    <w:p>
-      <w:pPr>
-        <w:jc w:val="both"/>
-        <w:rPr>
-          <w:rFonts w:ascii="Arial" w:hAnsi="Arial" w:cs="Arial"/>
-          <w:b/>
-          <w:bCs/>
-        </w:rPr>
-      </w:pPr>
-      <w:r>
-        <w:rPr>
-          <w:rFonts w:ascii="Arial" w:hAnsi="Arial" w:cs="Arial"/>
-          <w:b/>
-          <w:bCs/>
-        </w:rPr>
-        <w:t xml:space="preserve">17) R: </w:t>
-      </w:r>
-    </w:p>
-    <w:p>
-      <w:pPr>
-        <w:jc w:val="both"/>
-        <w:rPr>
-          <w:rFonts w:ascii="Arial" w:hAnsi="Arial" w:cs="Arial"/>
-          <w:b/>
-          <w:bCs/>
-        </w:rPr>
-      </w:pPr>
-    </w:p>
-    <w:p>
-      <w:pPr>
-        <w:jc w:val="both"/>
-        <w:rPr>
-          <w:rFonts w:ascii="Arial" w:hAnsi="Arial" w:cs="Arial"/>
-          <w:b/>
-          <w:bCs/>
-        </w:rPr>
-      </w:pPr>
-      <w:r>
-        <w:rPr>
-          <w:rFonts w:ascii="Arial" w:hAnsi="Arial" w:cs="Arial"/>
-          <w:b/>
-          <w:bCs/>
-        </w:rPr>
-        <w:t>18) O que são sensores de temperatura?</w:t>
-      </w:r>
-      <w:r>
-        <w:rPr>
-          <w:rFonts w:ascii="Arial" w:hAnsi="Arial" w:cs="Arial"/>
-          <w:b/>
-          <w:bCs/>
-        </w:rPr>
-        <w:t xml:space="preserve"> E quais são os tipos de sensores analógicos?</w:t>
-      </w:r>
-    </w:p>
-    <w:p>
-      <w:pPr>
-        <w:spacing w:after="0"/>
-        <w:jc w:val="both"/>
-        <w:rPr>
-          <w:rFonts w:ascii="Arial" w:hAnsi="Arial" w:cs="Arial"/>
-        </w:rPr>
-      </w:pPr>
-      <w:r>
-        <w:rPr>
-          <w:rFonts w:ascii="Arial" w:hAnsi="Arial" w:cs="Arial"/>
-          <w:b/>
-          <w:bCs/>
-        </w:rPr>
-        <w:t xml:space="preserve">18) R: </w:t>
-      </w:r>
-      <w:r>
-        <w:rPr>
-          <w:rFonts w:ascii="Arial" w:hAnsi="Arial" w:cs="Arial"/>
-        </w:rPr>
-        <w:t>Um sensor de temperatura é um dispositivo eletrônico que detecta</w:t>
-      </w:r>
-      <w:r>
-        <w:rPr>
-          <w:rFonts w:ascii="Arial" w:hAnsi="Arial" w:cs="Arial"/>
-        </w:rPr>
-        <w:t xml:space="preserve"> </w:t>
-      </w:r>
-      <w:r>
-        <w:rPr>
-          <w:rFonts w:ascii="Arial" w:hAnsi="Arial" w:cs="Arial"/>
-        </w:rPr>
-        <w:t>variações de calor em um ambiente ou objeto e as converte em sinais elétricos.</w:t>
-      </w:r>
-      <w:r>
-        <w:rPr>
-          <w:rFonts w:ascii="Arial" w:hAnsi="Arial" w:cs="Arial"/>
-        </w:rPr>
-        <w:t xml:space="preserve"> </w:t>
-      </w:r>
-      <w:r>
-        <w:rPr>
-          <w:rFonts w:ascii="Arial" w:hAnsi="Arial" w:cs="Arial"/>
-        </w:rPr>
-        <w:t>Esses sinais são lidos por controladores para monitorar, exibir ou regular processos de aquecimento e resfriamento em aplicações como automóveis, ar-condicionado e equipamentos industriais.</w:t>
-      </w:r>
-    </w:p>
-    <w:p>
-      <w:pPr>
-        <w:spacing w:after="0"/>
-        <w:jc w:val="both"/>
-        <w:rPr>
-          <w:rFonts w:ascii="Arial" w:hAnsi="Arial" w:cs="Arial"/>
-        </w:rPr>
-      </w:pPr>
-    </w:p>
-    <w:p>
-      <w:pPr>
-        <w:spacing w:after="0"/>
-        <w:jc w:val="both"/>
-        <w:rPr>
-          <w:rFonts w:ascii="Arial" w:hAnsi="Arial" w:cs="Arial"/>
-        </w:rPr>
-      </w:pPr>
-      <w:r>
-        <w:rPr>
-          <w:rFonts w:ascii="Arial" w:hAnsi="Arial" w:cs="Arial"/>
-          <w:b/>
-          <w:bCs/>
-        </w:rPr>
-        <w:t xml:space="preserve">NTC (Negative Temperature Coefficient): </w:t>
-      </w:r>
-      <w:r>
-        <w:rPr>
-          <w:rFonts w:ascii="Arial" w:hAnsi="Arial" w:cs="Arial"/>
-        </w:rPr>
-        <w:t>É</w:t>
-      </w:r>
-      <w:r>
-        <w:rPr>
-          <w:rFonts w:ascii="Arial" w:hAnsi="Arial" w:cs="Arial"/>
-        </w:rPr>
-        <w:t xml:space="preserve"> um termistor, ou seja, um componente eletrônico cuja resistência elétrica diminui à medida que a temperatura aumenta. São amplamente usados em termostatos, ar-condicionado e eletrônicos para medição precisa de temperatura </w:t>
-      </w:r>
-      <w:r>
-        <w:rPr>
-          <w:rFonts w:ascii="Arial" w:hAnsi="Arial" w:cs="Arial"/>
-          <w:b/>
-          <w:bCs/>
-        </w:rPr>
-        <w:t>(-50°C a 150°C)</w:t>
-      </w:r>
-      <w:r>
-        <w:rPr>
-          <w:rFonts w:ascii="Arial" w:hAnsi="Arial" w:cs="Arial"/>
-        </w:rPr>
-        <w:t xml:space="preserve"> e proteção térmica</w:t>
-      </w:r>
-      <w:r>
-        <w:rPr>
-          <w:rFonts w:ascii="Arial" w:hAnsi="Arial" w:cs="Arial"/>
-        </w:rPr>
-        <w:t>.</w:t>
-      </w:r>
-    </w:p>
-    <w:p>
-      <w:pPr>
-        <w:spacing w:after="0"/>
-        <w:jc w:val="both"/>
-        <w:rPr>
-          <w:rFonts w:ascii="Arial" w:hAnsi="Arial" w:cs="Arial"/>
-        </w:rPr>
-      </w:pPr>
-    </w:p>
-    <w:p>
-      <w:pPr>
-        <w:spacing w:after="0"/>
-        <w:jc w:val="both"/>
-        <w:rPr>
-          <w:rFonts w:ascii="Arial" w:hAnsi="Arial" w:cs="Arial"/>
-        </w:rPr>
-      </w:pPr>
-      <w:r>
-        <w:rPr>
-          <w:rFonts w:ascii="Arial" w:hAnsi="Arial" w:cs="Arial"/>
-          <w:b/>
-          <w:bCs/>
-        </w:rPr>
-        <w:t>Termopar Tipo K:</w:t>
-      </w:r>
-      <w:r>
-        <w:rPr>
-          <w:rFonts w:ascii="Arial" w:hAnsi="Arial" w:cs="Arial"/>
-        </w:rPr>
-        <w:t xml:space="preserve"> </w:t>
-      </w:r>
-      <w:r>
-        <w:rPr>
-          <w:rFonts w:ascii="Arial" w:hAnsi="Arial" w:cs="Arial"/>
-        </w:rPr>
-        <w:t>É</w:t>
-      </w:r>
-      <w:r>
-        <w:rPr>
-          <w:rFonts w:ascii="Arial" w:hAnsi="Arial" w:cs="Arial"/>
-        </w:rPr>
-        <w:t xml:space="preserve"> um sensor industrial popular e de baixo custo, composto por fios de Cromel (níquel-cromo) e Alumel (níquel-alumínio), ideal para altas temperaturas </w:t>
-      </w:r>
-      <w:r>
-        <w:rPr>
-          <w:rFonts w:ascii="Arial" w:hAnsi="Arial" w:cs="Arial"/>
-          <w:b/>
-          <w:bCs/>
-        </w:rPr>
-        <w:t>(-200</w:t>
-      </w:r>
-      <w:r>
-        <w:rPr>
-          <w:rFonts w:ascii="Arial" w:hAnsi="Arial" w:cs="Arial" w:hint="cs"/>
-          <w:b/>
-          <w:bCs/>
-        </w:rPr>
-        <w:t>°</w:t>
-      </w:r>
-      <w:r>
-        <w:rPr>
-          <w:rFonts w:ascii="Arial" w:hAnsi="Arial" w:cs="Arial"/>
-          <w:b/>
-          <w:bCs/>
-        </w:rPr>
-        <w:t xml:space="preserve">C a </w:t>
-      </w:r>
-      <w:r>
-        <w:rPr>
-          <w:rFonts w:ascii="Arial" w:hAnsi="Arial" w:cs="Arial"/>
-          <w:b/>
-          <w:bCs/>
-        </w:rPr>
-        <w:t>1250</w:t>
-      </w:r>
-      <w:r>
-        <w:rPr>
-          <w:rFonts w:ascii="Arial" w:hAnsi="Arial" w:cs="Arial" w:hint="cs"/>
-          <w:b/>
-          <w:bCs/>
-        </w:rPr>
-        <w:t>°</w:t>
-      </w:r>
-      <w:r>
-        <w:rPr>
-          <w:rFonts w:ascii="Arial" w:hAnsi="Arial" w:cs="Arial"/>
-          <w:b/>
-          <w:bCs/>
-        </w:rPr>
-        <w:t>C</w:t>
-      </w:r>
-      <w:r>
-        <w:rPr>
-          <w:rFonts w:ascii="Arial" w:hAnsi="Arial" w:cs="Arial"/>
-          <w:b/>
-          <w:bCs/>
-        </w:rPr>
-        <w:t xml:space="preserve"> ou até </w:t>
-      </w:r>
-      <w:r>
-        <w:rPr>
-          <w:rFonts w:ascii="Arial" w:hAnsi="Arial" w:cs="Arial"/>
-          <w:b/>
-          <w:bCs/>
-        </w:rPr>
-        <w:t>1372</w:t>
-      </w:r>
-      <w:r>
-        <w:rPr>
-          <w:rFonts w:ascii="Arial" w:hAnsi="Arial" w:cs="Arial" w:hint="cs"/>
-          <w:b/>
-          <w:bCs/>
-        </w:rPr>
-        <w:t>°</w:t>
-      </w:r>
-      <w:r>
-        <w:rPr>
-          <w:rFonts w:ascii="Arial" w:hAnsi="Arial" w:cs="Arial"/>
-          <w:b/>
-          <w:bCs/>
-        </w:rPr>
-        <w:t>C</w:t>
-      </w:r>
-      <w:r>
-        <w:rPr>
-          <w:rFonts w:ascii="Arial" w:hAnsi="Arial" w:cs="Arial"/>
-          <w:b/>
-          <w:bCs/>
-        </w:rPr>
-        <w:t>)</w:t>
-      </w:r>
-      <w:r>
-        <w:rPr>
-          <w:rFonts w:ascii="Arial" w:hAnsi="Arial" w:cs="Arial"/>
-        </w:rPr>
-        <w:t>.</w:t>
-      </w:r>
-    </w:p>
-    <w:p>
-      <w:pPr>
-        <w:jc w:val="both"/>
-        <w:rPr>
-          <w:rFonts w:ascii="Arial" w:hAnsi="Arial" w:cs="Arial"/>
           <w:b/>
           <w:bCs/>
         </w:rPr>
@@ -4275,50 +4269,24 @@
         <w:rPr>
           <w:rFonts w:ascii="Arial" w:hAnsi="Arial" w:cs="Arial"/>
         </w:rPr>
-        <w:t xml:space="preserve">É um sensor de temperatura amplamente utilizado na indústria, automação e eletrodomésticos para medir uma ampla faixa de temperaturas. Ele funciona com base em um princípio termoelétrico, sendo construído pela união de dois fios de metais diferentes (como ferro e </w:t>
-      </w:r>
-      <w:proofErr w:type="spellStart"/>
-      <w:r>
-        <w:rPr>
-          <w:rFonts w:ascii="Arial" w:hAnsi="Arial" w:cs="Arial"/>
-        </w:rPr>
-        <w:t>constantan</w:t>
-      </w:r>
-      <w:proofErr w:type="spellEnd"/>
-      <w:r>
-        <w:rPr>
-          <w:rFonts w:ascii="Arial" w:hAnsi="Arial" w:cs="Arial"/>
-        </w:rPr>
-        <w:t xml:space="preserve">, ou </w:t>
-      </w:r>
-      <w:proofErr w:type="spellStart"/>
-      <w:r>
-        <w:rPr>
-          <w:rFonts w:ascii="Arial" w:hAnsi="Arial" w:cs="Arial"/>
-        </w:rPr>
-        <w:t>chromel</w:t>
-      </w:r>
-      <w:proofErr w:type="spellEnd"/>
-      <w:r>
-        <w:rPr>
-          <w:rFonts w:ascii="Arial" w:hAnsi="Arial" w:cs="Arial"/>
-        </w:rPr>
-        <w:t xml:space="preserve"> e </w:t>
-      </w:r>
-      <w:proofErr w:type="spellStart"/>
-      <w:r>
-        <w:rPr>
-          <w:rFonts w:ascii="Arial" w:hAnsi="Arial" w:cs="Arial"/>
-        </w:rPr>
-        <w:t>alumel</w:t>
-      </w:r>
-      <w:proofErr w:type="spellEnd"/>
-      <w:r>
-        <w:rPr>
-          <w:rFonts w:ascii="Arial" w:hAnsi="Arial" w:cs="Arial"/>
-        </w:rPr>
-        <w:t>) soldados em uma extremidade, chamada de "junção de medição" ou "junta quente".</w:t>
-      </w:r>
+        <w:t>É um sensor de temperatura amplamente utilizado na indústria, automação e eletrodomésticos para medir uma ampla faixa de temperaturas. Ele funciona com base em um princípio termoelétrico, sendo construído pela união de dois fios de metais diferentes (como ferro e constantan, ou chromel e alumel) soldados em uma extremidade, chamada de "junção de medição" ou "junta quente".</w:t>
+      </w:r>
+    </w:p>
+    <w:p>
+      <w:pPr>
+        <w:jc w:val="both"/>
+        <w:rPr>
+          <w:rFonts w:ascii="Arial" w:hAnsi="Arial" w:cs="Arial"/>
+        </w:rPr>
+      </w:pPr>
+    </w:p>
+    <w:p>
+      <w:pPr>
+        <w:jc w:val="both"/>
+        <w:rPr>
+          <w:rFonts w:ascii="Arial" w:hAnsi="Arial" w:cs="Arial"/>
+        </w:rPr>
+      </w:pPr>
     </w:p>
     <w:p>
       <w:pPr>
@@ -4847,25 +4815,7 @@
           <w:b/>
           <w:bCs/>
         </w:rPr>
-        <w:t xml:space="preserve">Apresente um exemplo de dimerização com o LED a partir de um programa temporizado, como por exemplo (dimerização a cada 100 </w:t>
-      </w:r>
-      <w:proofErr w:type="spellStart"/>
-      <w:r>
-        <w:rPr>
-          <w:rFonts w:ascii="Arial" w:hAnsi="Arial" w:cs="Arial"/>
-          <w:b/>
-          <w:bCs/>
-        </w:rPr>
-        <w:t>ms</w:t>
-      </w:r>
-      <w:proofErr w:type="spellEnd"/>
-      <w:r>
-        <w:rPr>
-          <w:rFonts w:ascii="Arial" w:hAnsi="Arial" w:cs="Arial"/>
-          <w:b/>
-          <w:bCs/>
-        </w:rPr>
-        <w:t>)</w:t>
+        <w:t>Apresente um exemplo de dimerização com o LED a partir de um programa temporizado, como por exemplo (dimerização a cada 100 ms)</w:t>
       </w:r>
       <w:r>
         <w:rPr>
@@ -4893,6 +4843,18 @@
         </w:rPr>
         <w:t xml:space="preserve">22.1) R: </w:t>
       </w:r>
+      <w:r>
+        <w:rPr>
+          <w:rFonts w:ascii="Arial" w:hAnsi="Arial" w:cs="Arial"/>
+        </w:rPr>
+        <w:t>Vídeo no Visual Studio Code</w:t>
+      </w:r>
+      <w:r>
+        <w:rPr>
+          <w:rFonts w:ascii="Arial" w:hAnsi="Arial" w:cs="Arial"/>
+        </w:rPr>
+        <w:t>.</w:t>
+      </w:r>
     </w:p>
     <w:p>
       <w:pPr>
@@ -4970,6 +4932,18 @@
           <w:bCs/>
         </w:rPr>
         <w:t xml:space="preserve">22.2) R: </w:t>
+      </w:r>
+      <w:r>
+        <w:rPr>
+          <w:rFonts w:ascii="Arial" w:hAnsi="Arial" w:cs="Arial"/>
+        </w:rPr>
+        <w:t>Vídeo no Visual Studio Code</w:t>
+      </w:r>
+      <w:r>
+        <w:rPr>
+          <w:rFonts w:ascii="Arial" w:hAnsi="Arial" w:cs="Arial"/>
+        </w:rPr>
+        <w:t>.</w:t>
       </w:r>
     </w:p>
     <w:p>
@@ -5339,20 +5313,8 @@
     </w:p>
     <w:p>
       <w:pPr>
-        <w:pStyle w:val="PargrafodaLista"/>
-        <w:rPr>
-          <w:rFonts w:ascii="Arial" w:hAnsi="Arial" w:cs="Arial"/>
-          <w:b/>
-          <w:bCs/>
-        </w:rPr>
-      </w:pPr>
-    </w:p>
-    <w:p>
-      <w:pPr>
-        <w:rPr>
-          <w:rFonts w:ascii="Arial" w:hAnsi="Arial" w:cs="Arial"/>
-          <w:b/>
-          <w:bCs/>
+        <w:rPr>
+          <w:rFonts w:ascii="Arial" w:hAnsi="Arial" w:cs="Arial"/>
         </w:rPr>
       </w:pPr>
       <w:r>
@@ -5425,6 +5387,86 @@
         </w:rPr>
         <w:t>Um push button (botão de pressão) é um componente eletromecânico que funciona como um interruptor momentâneo. Ao pressioná-lo, ele permite a passagem de corrente elétrica (fechando o circuito) e, ao soltá-lo, uma mola interna o retorna à posição original, interrompendo a corrente (abrindo o circuito). É muito utilizado em protoboards e projetos com Arduino.</w:t>
       </w:r>
+    </w:p>
+    <w:p>
+      <w:pPr>
+        <w:rPr>
+          <w:rFonts w:ascii="Arial" w:hAnsi="Arial" w:cs="Arial"/>
+        </w:rPr>
+      </w:pPr>
+    </w:p>
+    <w:p>
+      <w:pPr>
+        <w:rPr>
+          <w:rFonts w:ascii="Arial" w:hAnsi="Arial" w:cs="Arial"/>
+          <w:b/>
+          <w:bCs/>
+        </w:rPr>
+      </w:pPr>
+      <w:r>
+        <w:rPr>
+          <w:rFonts w:ascii="Arial" w:hAnsi="Arial" w:cs="Arial"/>
+          <w:b/>
+          <w:bCs/>
+        </w:rPr>
+        <w:t>24)</w:t>
+      </w:r>
+      <w:r>
+        <w:rPr>
+          <w:rFonts w:ascii="Arial" w:hAnsi="Arial" w:cs="Arial"/>
+          <w:b/>
+          <w:bCs/>
+        </w:rPr>
+        <w:t xml:space="preserve"> O que é um Display de Sete Segmentos?</w:t>
+      </w:r>
+    </w:p>
+    <w:p>
+      <w:pPr>
+        <w:rPr>
+          <w:rFonts w:ascii="Arial" w:hAnsi="Arial" w:cs="Arial"/>
+        </w:rPr>
+      </w:pPr>
+      <w:r>
+        <w:rPr>
+          <w:rFonts w:ascii="Arial" w:hAnsi="Arial" w:cs="Arial"/>
+          <w:b/>
+          <w:bCs/>
+        </w:rPr>
+        <w:t>24) R:</w:t>
+      </w:r>
+      <w:r>
+        <w:rPr>
+          <w:rFonts w:ascii="Arial" w:hAnsi="Arial" w:cs="Arial"/>
+        </w:rPr>
+        <w:t xml:space="preserve"> </w:t>
+      </w:r>
+      <w:r>
+        <w:rPr>
+          <w:rFonts w:ascii="Arial" w:hAnsi="Arial" w:cs="Arial"/>
+        </w:rPr>
+        <w:t>É um componente eletrônico utilizado para exibir números (de 0 a 9) por meio da combinação de sete pequenos segmentos luminosos (geralmente LEDs), que são acionados individualmente para formar os dígitos. Ele é amplamente utilizado em dispositivos como relógios digitais, calculadoras e painéis eletrônicos.</w:t>
+      </w:r>
+    </w:p>
+    <w:p>
+      <w:pPr>
+        <w:pBdr>
+          <w:bottom w:val="single" w:sz="6" w:space="1" w:color="auto"/>
+        </w:pBdr>
+        <w:rPr>
+          <w:rFonts w:ascii="Arial" w:hAnsi="Arial" w:cs="Arial"/>
+          <w:b/>
+          <w:bCs/>
+        </w:rPr>
+      </w:pPr>
+    </w:p>
+    <w:p>
+      <w:pPr>
+        <w:rPr>
+          <w:rFonts w:ascii="Arial" w:hAnsi="Arial" w:cs="Arial"/>
+          <w:b/>
+          <w:bCs/>
+        </w:rPr>
+      </w:pPr>
     </w:p>
     <w:p>
       <w:pPr>
@@ -5445,7 +5487,6 @@
           <w:sz w:val="40"/>
           <w:szCs w:val="40"/>
         </w:rPr>
-        <w:lastRenderedPageBreak/>
         <w:t>Conclusão</w:t>
       </w:r>
     </w:p>
@@ -5611,7 +5652,7 @@
 </file>
 
 <file path=word/numbering.xml><?xml version="1.0" encoding="utf-8"?>
-<w:numbering xmlns:wpc="http://schemas.microsoft.com/office/word/2010/wordprocessingCanvas" xmlns:cx="http://schemas.microsoft.com/office/drawing/2014/chartex" xmlns:cx1="http://schemas.microsoft.com/office/drawing/2015/9/8/chartex" xmlns:cx2="http://schemas.microsoft.com/office/drawing/2015/10/21/chartex" xmlns:cx3="http://schemas.microsoft.com/office/drawing/2016/5/9/chartex" xmlns:cx4="http://schemas.microsoft.com/office/drawing/2016/5/10/chartex" xmlns:cx5="http://schemas.microsoft.com/office/drawing/2016/5/11/chartex" xmlns:cx6="http://schemas.microsoft.com/office/drawing/2016/5/12/chartex" xmlns:cx7="http://schemas.microsoft.com/office/drawing/2016/5/13/chartex" xmlns:cx8="http://schemas.microsoft.com/office/drawing/2016/5/14/chartex" xmlns:mc="http://schemas.openxmlformats.org/markup-compatibility/2006" xmlns:aink="http://schemas.microsoft.com/office/drawing/2016/ink" xmlns:am3d="http://schemas.microsoft.com/office/drawing/2017/model3d" xmlns:o="urn:schemas-microsoft-com:office:office" xmlns:oel="http://schemas.microsoft.com/office/2019/extlst" xmlns:r="http://schemas.openxmlformats.org/officeDocument/2006/relationships" xmlns:m="http://schemas.openxmlformats.org/officeDocument/2006/math" xmlns:v="urn:schemas-microsoft-com:vml" xmlns:wp14="http://schemas.microsoft.com/office/word/2010/wordprocessingDrawing" xmlns:wp="http://schemas.openxmlformats.org/drawingml/2006/wordprocessingDrawing" xmlns:w10="urn:schemas-microsoft-com:office:word" xmlns:w="http://schemas.openxmlformats.org/wordprocessingml/2006/main" xmlns:w14="http://schemas.microsoft.com/office/word/2010/wordml" xmlns:w15="http://schemas.microsoft.com/office/word/2012/wordml" xmlns:w16cex="http://schemas.microsoft.com/office/word/2018/wordml/cex" xmlns:w16cid="http://schemas.microsoft.com/office/word/2016/wordml/cid" xmlns:w16="http://schemas.microsoft.com/office/word/2018/wordml" xmlns:w16sdtdh="http://schemas.microsoft.com/office/word/2020/wordml/sdtdatahash" xmlns:w16se="http://schemas.microsoft.com/office/word/2015/wordml/symex" xmlns:wpg="http://schemas.microsoft.com/office/word/2010/wordprocessingGroup" xmlns:wpi="http://schemas.microsoft.com/office/word/2010/wordprocessingInk" xmlns:wne="http://schemas.microsoft.com/office/word/2006/wordml" xmlns:wps="http://schemas.microsoft.com/office/word/2010/wordprocessingShape" mc:Ignorable="w14 w15 w16se w16cid w16 w16cex w16sdtdh wp14">
+<w:numbering xmlns:wpc="http://schemas.microsoft.com/office/word/2010/wordprocessingCanvas" xmlns:cx="http://schemas.microsoft.com/office/drawing/2014/chartex" xmlns:cx1="http://schemas.microsoft.com/office/drawing/2015/9/8/chartex" xmlns:cx2="http://schemas.microsoft.com/office/drawing/2015/10/21/chartex" xmlns:cx3="http://schemas.microsoft.com/office/drawing/2016/5/9/chartex" xmlns:cx4="http://schemas.microsoft.com/office/drawing/2016/5/10/chartex" xmlns:cx5="http://schemas.microsoft.com/office/drawing/2016/5/11/chartex" xmlns:cx6="http://schemas.microsoft.com/office/drawing/2016/5/12/chartex" xmlns:cx7="http://schemas.microsoft.com/office/drawing/2016/5/13/chartex" xmlns:cx8="http://schemas.microsoft.com/office/drawing/2016/5/14/chartex" xmlns:mc="http://schemas.openxmlformats.org/markup-compatibility/2006" xmlns:aink="http://schemas.microsoft.com/office/drawing/2016/ink" xmlns:am3d="http://schemas.microsoft.com/office/drawing/2017/model3d" xmlns:o="urn:schemas-microsoft-com:office:office" xmlns:oel="http://schemas.microsoft.com/office/2019/extlst" xmlns:r="http://schemas.openxmlformats.org/officeDocument/2006/relationships" xmlns:m="http://schemas.openxmlformats.org/officeDocument/2006/math" xmlns:v="urn:schemas-microsoft-com:vml" xmlns:wp14="http://schemas.microsoft.com/office/word/2010/wordprocessingDrawing" xmlns:wp="http://schemas.openxmlformats.org/drawingml/2006/wordprocessingDrawing" xmlns:w10="urn:schemas-microsoft-com:office:word" xmlns:w="http://schemas.openxmlformats.org/wordprocessingml/2006/main" xmlns:w14="http://schemas.microsoft.com/office/word/2010/wordml" xmlns:w15="http://schemas.microsoft.com/office/word/2012/wordml" xmlns:w16cex="http://schemas.microsoft.com/office/word/2018/wordml/cex" xmlns:w16cid="http://schemas.microsoft.com/office/word/2016/wordml/cid" xmlns:w16="http://schemas.microsoft.com/office/word/2018/wordml" xmlns:w16du="http://schemas.microsoft.com/office/word/2023/wordml/word16du" xmlns:w16sdtdh="http://schemas.microsoft.com/office/word/2020/wordml/sdtdatahash" xmlns:w16sdtfl="http://schemas.microsoft.com/office/word/2024/wordml/sdtformatlock" xmlns:w16se="http://schemas.microsoft.com/office/word/2015/wordml/symex" xmlns:wpg="http://schemas.microsoft.com/office/word/2010/wordprocessingGroup" xmlns:wpi="http://schemas.microsoft.com/office/word/2010/wordprocessingInk" xmlns:wne="http://schemas.microsoft.com/office/word/2006/wordml" xmlns:wps="http://schemas.microsoft.com/office/word/2010/wordprocessingShape" mc:Ignorable="w14 w15 w16se w16cid w16 w16cex w16sdtdh w16sdtfl w16du wp14">
   <w:abstractNum w:abstractNumId="0" w15:restartNumberingAfterBreak="0">
     <w:nsid w:val="0C87546D"/>
     <w:multiLevelType w:val="hybridMultilevel"/>
@@ -6404,7 +6445,7 @@
 </file>
 
 <file path=word/styles.xml><?xml version="1.0" encoding="utf-8"?>
-<w:styles xmlns:mc="http://schemas.openxmlformats.org/markup-compatibility/2006" xmlns:r="http://schemas.openxmlformats.org/officeDocument/2006/relationships" xmlns:w="http://schemas.openxmlformats.org/wordprocessingml/2006/main" xmlns:w14="http://schemas.microsoft.com/office/word/2010/wordml" xmlns:w15="http://schemas.microsoft.com/office/word/2012/wordml" xmlns:w16cex="http://schemas.microsoft.com/office/word/2018/wordml/cex" xmlns:w16cid="http://schemas.microsoft.com/office/word/2016/wordml/cid" xmlns:w16="http://schemas.microsoft.com/office/word/2018/wordml" xmlns:w16sdtdh="http://schemas.microsoft.com/office/word/2020/wordml/sdtdatahash" xmlns:w16se="http://schemas.microsoft.com/office/word/2015/wordml/symex" mc:Ignorable="w14 w15 w16se w16cid w16 w16cex w16sdtdh">
+<w:styles xmlns:mc="http://schemas.openxmlformats.org/markup-compatibility/2006" xmlns:r="http://schemas.openxmlformats.org/officeDocument/2006/relationships" xmlns:w="http://schemas.openxmlformats.org/wordprocessingml/2006/main" xmlns:w14="http://schemas.microsoft.com/office/word/2010/wordml" xmlns:w15="http://schemas.microsoft.com/office/word/2012/wordml" xmlns:w16cex="http://schemas.microsoft.com/office/word/2018/wordml/cex" xmlns:w16cid="http://schemas.microsoft.com/office/word/2016/wordml/cid" xmlns:w16="http://schemas.microsoft.com/office/word/2018/wordml" xmlns:w16du="http://schemas.microsoft.com/office/word/2023/wordml/word16du" xmlns:w16sdtdh="http://schemas.microsoft.com/office/word/2020/wordml/sdtdatahash" xmlns:w16sdtfl="http://schemas.microsoft.com/office/word/2024/wordml/sdtformatlock" xmlns:w16se="http://schemas.microsoft.com/office/word/2015/wordml/symex" mc:Ignorable="w14 w15 w16se w16cid w16 w16cex w16sdtdh w16sdtfl w16du">
   <w:docDefaults>
     <w:rPrDefault>
       <w:rPr>

</xml_diff>